<commit_message>
v0.7.1: replace Mixamo Xbot with CC0 Quaternius mannequin (366 KB); docs, X8 flag
</commit_message>
<xml_diff>
--- a/docs/AUDIT-HANDOFF.docx
+++ b/docs/AUDIT-HANDOFF.docx
@@ -7,7 +7,7 @@
         <w:pStyle w:val="Title"/>
       </w:pPr>
       <w:r>
-        <w:t>FitcoachAI — Audit handoff (prototype v0.7.0)</w:t>
+        <w:t>FitcoachAI — Audit handoff (prototype v0.7.1)</w:t>
       </w:r>
     </w:p>
     <w:p>
@@ -389,7 +389,7 @@
           </w:tcPr>
           <w:p>
             <w:r>
-              <w:t>Onboarding, health check, body map, voice baseline, 2-week plan; 3D coach (three.js + Xbot) and muscle-map highlighter.</w:t>
+              <w:t>Onboarding, health check, body map, voice baseline, 2-week plan; 3D coach (three.js + a Mixamo-derived Xbot, replaced in v0.7.1) and muscle-map highlighter.</w:t>
             </w:r>
           </w:p>
         </w:tc>
@@ -645,6 +645,38 @@
           </w:tcPr>
           <w:p>
             <w:r>
+              <w:t>v0.7.1</w:t>
+            </w:r>
+          </w:p>
+        </w:tc>
+        <w:tc>
+          <w:tcPr>
+            <w:tcW w:type="dxa" w:w="2880"/>
+          </w:tcPr>
+          <w:p>
+            <w:r>
+              <w:t>(this release)</w:t>
+            </w:r>
+          </w:p>
+        </w:tc>
+        <w:tc>
+          <w:tcPr>
+            <w:tcW w:type="dxa" w:w="2880"/>
+          </w:tcPr>
+          <w:p>
+            <w:r>
+              <w:t>3D coach swapped to a CC0 Quaternius mannequin (366 KB, was the 2.93 MB Mixamo-derived Xbot). Idle animation only, as before.</w:t>
+            </w:r>
+          </w:p>
+        </w:tc>
+      </w:tr>
+      <w:tr>
+        <w:tc>
+          <w:tcPr>
+            <w:tcW w:type="dxa" w:w="2880"/>
+          </w:tcPr>
+          <w:p>
+            <w:r>
               <w:t>v0.7.0</w:t>
             </w:r>
           </w:p>
@@ -953,7 +985,7 @@
         <w:rPr>
           <w:rFonts w:ascii="Courier New" w:hAnsi="Courier New"/>
         </w:rPr>
-        <w:t>fcai-v0.7.0</w:t>
+        <w:t>fcai-v0.7.1</w:t>
       </w:r>
       <w:r>
         <w:t>) that precaches the app, three.js and the 3D model.</w:t>
@@ -1377,7 +1409,7 @@
               <w:rPr>
                 <w:rFonts w:ascii="Courier New" w:hAnsi="Courier New"/>
               </w:rPr>
-              <w:t>assets/Xbot.glb</w:t>
+              <w:t>assets/coach-mannequin.glb</w:t>
             </w:r>
             <w:r/>
           </w:p>
@@ -1388,7 +1420,7 @@
           </w:tcPr>
           <w:p>
             <w:r>
-              <w:t>3D mannequin (Mixamo-derived, prototype only)</w:t>
+              <w:t>3D mannequin (Quaternius, CC0), idle loop only</w:t>
             </w:r>
           </w:p>
         </w:tc>
@@ -2136,31 +2168,10 @@
         <w:rPr>
           <w:b/>
         </w:rPr>
-        <w:t>Code heuristics:</w:t>
-      </w:r>
-      <w:r>
-        <w:t xml:space="preserve"> X1 evidence tiers; X2 tolerance labels; X3 rest-day touchpoint; X4 measure-chip ranges; X5 step-up verification; X6 injury flag from onboarding; X7 reminder demo.</w:t>
-      </w:r>
-    </w:p>
-    <w:p>
-      <w:pPr>
-        <w:pStyle w:val="Heading2"/>
-      </w:pPr>
-      <w:r>
-        <w:t>11 open questions in the onboarding spec (§7.1)</w:t>
-      </w:r>
-    </w:p>
-    <w:p>
-      <w:r>
-        <w:t>OQ-1a pelvic-floor physio review of the postpartum rules; OQ-5 legal and clinical sign-off and localisation of the safety wording; OQ-6b whether people 70+ default to gentle mode; OQ-9 holidays (locale vs Calendar access); OQ-11 backups/export; OQ-12 optional first name for voice; OQ-13 voice reliability in noisy homes; OQ-15 regulatory positioning (general wellness) and App Store rules; OQ-16 screen count; OQ-17 gentle-mode details; OQ-18 Apple Health read types.</w:t>
-      </w:r>
-    </w:p>
-    <w:p>
-      <w:pPr>
-        <w:pStyle w:val="Heading2"/>
-      </w:pPr>
-      <w:r>
-        <w:t>Next steps</w:t>
+        <w:t>v0.7.1:</w:t>
+      </w:r>
+      <w:r>
+        <w:t xml:space="preserve"> X8 look of the 3D coach (placeholder art).</w:t>
       </w:r>
     </w:p>
     <w:p>
@@ -2172,10 +2183,31 @@
         <w:rPr>
           <w:b/>
         </w:rPr>
-        <w:t>Native SwiftUI app.</w:t>
-      </w:r>
-      <w:r>
-        <w:t xml:space="preserve"> The prototype logic (engine, config, copy) is the reference to port. The web-specific parts (service worker, Safari workarounds, localStorage) do not carry over.</w:t>
+        <w:t>Code heuristics:</w:t>
+      </w:r>
+      <w:r>
+        <w:t xml:space="preserve"> X1 evidence tiers; X2 tolerance labels; X3 rest-day touchpoint; X4 measure-chip ranges; X5 step-up verification; X6 injury flag from onboarding; X7 reminder demo.</w:t>
+      </w:r>
+    </w:p>
+    <w:p>
+      <w:pPr>
+        <w:pStyle w:val="Heading2"/>
+      </w:pPr>
+      <w:r>
+        <w:t>11 open questions in the onboarding spec (§7.1)</w:t>
+      </w:r>
+    </w:p>
+    <w:p>
+      <w:r>
+        <w:t>OQ-1a pelvic-floor physio review of the postpartum rules; OQ-5 legal and clinical sign-off and localisation of the safety wording; OQ-6b whether people 70+ default to gentle mode; OQ-9 holidays (locale vs Calendar access); OQ-11 backups/export; OQ-12 optional first name for voice; OQ-13 voice reliability in noisy homes; OQ-15 regulatory positioning (general wellness) and App Store rules; OQ-16 screen count; OQ-17 gentle-mode details; OQ-18 Apple Health read types.</w:t>
+      </w:r>
+    </w:p>
+    <w:p>
+      <w:pPr>
+        <w:pStyle w:val="Heading2"/>
+      </w:pPr>
+      <w:r>
+        <w:t>Next steps</w:t>
       </w:r>
     </w:p>
     <w:p>
@@ -2187,10 +2219,10 @@
         <w:rPr>
           <w:b/>
         </w:rPr>
-        <w:t>Replace `assets/Xbot.glb`.</w:t>
-      </w:r>
-      <w:r>
-        <w:t xml:space="preserve"> It is Mixamo-derived (Adobe) and allowed only for prototyping; it needs a CC0 or properly licensed model before any production use.</w:t>
+        <w:t>Native SwiftUI app.</w:t>
+      </w:r>
+      <w:r>
+        <w:t xml:space="preserve"> The prototype logic (engine, config, copy) is the reference to port. The web-specific parts (service worker, Safari workarounds, localStorage) do not carry over.</w:t>
       </w:r>
     </w:p>
     <w:p>
@@ -2449,7 +2481,7 @@
         <w:pStyle w:val="ListNumber"/>
       </w:pPr>
       <w:r>
-        <w:t>three.js (MIT), rich-body-highlighter (MIT) and Xbot.glb (Mixamo, prototype only, must be replaced). Check that no other assets lack a license.</w:t>
+        <w:t>three.js (MIT), rich-body-highlighter (MIT) and coach-mannequin.glb (Quaternius, CC0, see README credits). Check that no other assets lack a license.</w:t>
       </w:r>
     </w:p>
     <w:p>
@@ -2545,7 +2577,7 @@
         <w:pStyle w:val="ListBullet"/>
       </w:pPr>
       <w:r>
-        <w:t>Every threshold in R1–R26 and X1–X7 is a placeholder without expert validation.</w:t>
+        <w:t>Every threshold in R1–R26 and X1–X8 is a placeholder without expert validation.</w:t>
       </w:r>
     </w:p>
     <w:p>

</xml_diff>

<commit_message>
docs: v0.7.2 Lighthouse + polish notes, handoff docx
</commit_message>
<xml_diff>
--- a/docs/AUDIT-HANDOFF.docx
+++ b/docs/AUDIT-HANDOFF.docx
@@ -7,7 +7,7 @@
         <w:pStyle w:val="Title"/>
       </w:pPr>
       <w:r>
-        <w:t>FitcoachAI — Audit handoff (prototype v0.7.1)</w:t>
+        <w:t>FitcoachAI — Audit handoff (prototype v0.7.2)</w:t>
       </w:r>
     </w:p>
     <w:p>
@@ -654,6 +654,43 @@
             <w:tcW w:type="dxa" w:w="2880"/>
           </w:tcPr>
           <w:p>
+            <w:r/>
+            <w:r>
+              <w:rPr>
+                <w:rFonts w:ascii="Courier New" w:hAnsi="Courier New"/>
+              </w:rPr>
+              <w:t>7fcb5b5</w:t>
+            </w:r>
+            <w:r/>
+          </w:p>
+        </w:tc>
+        <w:tc>
+          <w:tcPr>
+            <w:tcW w:type="dxa" w:w="2880"/>
+          </w:tcPr>
+          <w:p>
+            <w:r>
+              <w:t>3D coach swapped to a CC0 Quaternius mannequin (366 KB, was the 2.93 MB Mixamo-derived Xbot). Idle animation only, as before.</w:t>
+            </w:r>
+          </w:p>
+        </w:tc>
+      </w:tr>
+      <w:tr>
+        <w:tc>
+          <w:tcPr>
+            <w:tcW w:type="dxa" w:w="2880"/>
+          </w:tcPr>
+          <w:p>
+            <w:r>
+              <w:t>v0.7.2</w:t>
+            </w:r>
+          </w:p>
+        </w:tc>
+        <w:tc>
+          <w:tcPr>
+            <w:tcW w:type="dxa" w:w="2880"/>
+          </w:tcPr>
+          <w:p>
             <w:r>
               <w:t>(this release)</w:t>
             </w:r>
@@ -665,7 +702,7 @@
           </w:tcPr>
           <w:p>
             <w:r>
-              <w:t>3D coach swapped to a CC0 Quaternius mannequin (366 KB, was the 2.93 MB Mixamo-derived Xbot). Idle animation only, as before.</w:t>
+              <w:t>Polish: coach auto-framing, runtime palette tint, ground shadow, loading placeholder, fade-in, failure fallback, reduced motion; caption bar no longer hides Stop on iPhone SE; small layout fixes. Lighthouse numbers in UX-AUDIT.md.</w:t>
             </w:r>
           </w:p>
         </w:tc>
@@ -985,7 +1022,7 @@
         <w:rPr>
           <w:rFonts w:ascii="Courier New" w:hAnsi="Courier New"/>
         </w:rPr>
-        <w:t>fcai-v0.7.1</w:t>
+        <w:t>fcai-v0.7.2b</w:t>
       </w:r>
       <w:r>
         <w:t>) that precaches the app, three.js and the 3D model.</w:t>
@@ -2022,7 +2059,16 @@
         <w:t>v07.js</w:t>
       </w:r>
       <w:r>
-        <w:t xml:space="preserve"> (lighter session, modification, why line, schema 4). At v0.7.0 all passed on Chromium and WebKit: v07 28, v06 29, v05 32, ui 32, test 28, inv 18, audit 34 taps / 15 screens.</w:t>
+        <w:t xml:space="preserve"> (lighter session, modification, why line, schema 4), </w:t>
+      </w:r>
+      <w:r>
+        <w:rPr>
+          <w:rFonts w:ascii="Courier New" w:hAnsi="Courier New"/>
+        </w:rPr>
+        <w:t>v072.js</w:t>
+      </w:r>
+      <w:r>
+        <w:t xml:space="preserve"> (3D coach reduced motion / fit / fallback, caption bar vs Stop). At v0.7.2 all 8 suites passed on Chromium and WebKit. At v0.7.0 all passed on Chromium and WebKit: v07 28, v06 29, v05 32, ui 32, test 28, inv 18, audit 34 taps / 15 screens.</w:t>
       </w:r>
     </w:p>
     <w:p>
@@ -2171,7 +2217,7 @@
         <w:t>v0.7.1:</w:t>
       </w:r>
       <w:r>
-        <w:t xml:space="preserve"> X8 look of the 3D coach (placeholder art).</w:t>
+        <w:t xml:space="preserve"> X8 look of the 3D coach (placeholder art). In v0.7.2 it is tinted to the app palette at runtime only; the CC0 file is unchanged.</w:t>
       </w:r>
     </w:p>
     <w:p>

</xml_diff>

<commit_message>
v0.8.0: CC0 sit-to-stand 3D demo on intro/active screens; X9 demo gaps; Decision Round 1 doc
</commit_message>
<xml_diff>
--- a/docs/AUDIT-HANDOFF.docx
+++ b/docs/AUDIT-HANDOFF.docx
@@ -7,7 +7,7 @@
         <w:pStyle w:val="Title"/>
       </w:pPr>
       <w:r>
-        <w:t>FitcoachAI — Audit handoff (prototype v0.7.2)</w:t>
+        <w:t>FitcoachAI — Audit handoff (prototype v0.8.0)</w:t>
       </w:r>
     </w:p>
     <w:p>
@@ -691,6 +691,43 @@
             <w:tcW w:type="dxa" w:w="2880"/>
           </w:tcPr>
           <w:p>
+            <w:r/>
+            <w:r>
+              <w:rPr>
+                <w:rFonts w:ascii="Courier New" w:hAnsi="Courier New"/>
+              </w:rPr>
+              <w:t>8958a16</w:t>
+            </w:r>
+            <w:r/>
+          </w:p>
+        </w:tc>
+        <w:tc>
+          <w:tcPr>
+            <w:tcW w:type="dxa" w:w="2880"/>
+          </w:tcPr>
+          <w:p>
+            <w:r>
+              <w:t>Polish: coach auto-framing, runtime palette tint, ground shadow, loading placeholder, fade-in, failure fallback, reduced motion; caption bar no longer hides Stop on iPhone SE; small layout fixes. Lighthouse numbers in UX-AUDIT.md.</w:t>
+            </w:r>
+          </w:p>
+        </w:tc>
+      </w:tr>
+      <w:tr>
+        <w:tc>
+          <w:tcPr>
+            <w:tcW w:type="dxa" w:w="2880"/>
+          </w:tcPr>
+          <w:p>
+            <w:r>
+              <w:t>v0.8.0</w:t>
+            </w:r>
+          </w:p>
+        </w:tc>
+        <w:tc>
+          <w:tcPr>
+            <w:tcW w:type="dxa" w:w="2880"/>
+          </w:tcPr>
+          <w:p>
             <w:r>
               <w:t>(this release)</w:t>
             </w:r>
@@ -702,7 +739,25 @@
           </w:tcPr>
           <w:p>
             <w:r>
-              <w:t>Polish: coach auto-framing, runtime palette tint, ground shadow, loading placeholder, fade-in, failure fallback, reduced motion; caption bar no longer hides Stop on iPhone SE; small layout fixes. Lighthouse numbers in UX-AUDIT.md.</w:t>
+              <w:t xml:space="preserve">Sit-to-stand 3D demo (CC0 Quaternius </w:t>
+            </w:r>
+            <w:r>
+              <w:rPr>
+                <w:rFonts w:ascii="Courier New" w:hAnsi="Courier New"/>
+              </w:rPr>
+              <w:t>Sitting_Exit</w:t>
+            </w:r>
+            <w:r>
+              <w:t>/</w:t>
+            </w:r>
+            <w:r>
+              <w:rPr>
+                <w:rFonts w:ascii="Courier New" w:hAnsi="Courier New"/>
+              </w:rPr>
+              <w:t>Sitting_Enter</w:t>
+            </w:r>
+            <w:r>
+              <w:t xml:space="preserve"> on a simple chair) on the intro and active screens of the 3 sit-to-stand steps. No other exercise has an honest CC0 clip, so they are listed as X9. Model 502 KB.</w:t>
             </w:r>
           </w:p>
         </w:tc>
@@ -1022,7 +1077,7 @@
         <w:rPr>
           <w:rFonts w:ascii="Courier New" w:hAnsi="Courier New"/>
         </w:rPr>
-        <w:t>fcai-v0.7.2b</w:t>
+        <w:t>fcai-v0.8.0</w:t>
       </w:r>
       <w:r>
         <w:t>) that precaches the app, three.js and the 3D model.</w:t>
@@ -1457,7 +1512,7 @@
           </w:tcPr>
           <w:p>
             <w:r>
-              <w:t>3D mannequin (Quaternius, CC0), idle loop only</w:t>
+              <w:t>3D mannequin (Quaternius, CC0): idle loop, plus stand-up/sit-down clips for the sit-to-stand demo</w:t>
             </w:r>
           </w:p>
         </w:tc>
@@ -2047,6 +2102,15 @@
         <w:rPr>
           <w:rFonts w:ascii="Courier New" w:hAnsi="Courier New"/>
         </w:rPr>
+        <w:t>v080.js</w:t>
+      </w:r>
+      <w:r>
+        <w:t xml:space="preserve"> (sit-to-stand demo), </w:t>
+      </w:r>
+      <w:r>
+        <w:rPr>
+          <w:rFonts w:ascii="Courier New" w:hAnsi="Courier New"/>
+        </w:rPr>
         <w:t>v06.js</w:t>
       </w:r>
       <w:r>
@@ -2203,6 +2267,30 @@
       </w:r>
       <w:r>
         <w:t xml:space="preserve"> R23 post-session effects including the lighter next session; R24 experience → tone only; R25 modification path; R26 days-per-week suggestion.</w:t>
+      </w:r>
+    </w:p>
+    <w:p>
+      <w:pPr>
+        <w:pStyle w:val="ListBullet"/>
+      </w:pPr>
+      <w:r/>
+      <w:r>
+        <w:rPr>
+          <w:b/>
+        </w:rPr>
+        <w:t>v0.8.0:</w:t>
+      </w:r>
+      <w:r>
+        <w:t xml:space="preserve"> X9 demo animations needed (every exercise except sit-to-stand). Decisions for all open items are in </w:t>
+      </w:r>
+      <w:r>
+        <w:rPr>
+          <w:rFonts w:ascii="Courier New" w:hAnsi="Courier New"/>
+        </w:rPr>
+        <w:t>docs/DECISION-ROUND-1.md</w:t>
+      </w:r>
+      <w:r>
+        <w:t>.</w:t>
       </w:r>
     </w:p>
     <w:p>

</xml_diff>

<commit_message>
v0.9.0: apply Decision Round 1 (35 approved, 9 deferred); R12 +15s rest, R25 repeat-skip note, OQ-18 copy, OQ-1a interim C-section line; placeholder labels removed; v090 tests
</commit_message>
<xml_diff>
--- a/docs/AUDIT-HANDOFF.docx
+++ b/docs/AUDIT-HANDOFF.docx
@@ -4,10 +4,10 @@
   <w:body>
     <w:p>
       <w:pPr>
-        <w:pStyle w:val="Title"/>
+        <w:pStyle w:val="Heading1"/>
       </w:pPr>
       <w:r>
-        <w:t>FitcoachAI — Audit handoff (prototype v0.8.0)</w:t>
+        <w:t>FitcoachAI — Audit handoff (prototype v0.9.0)</w:t>
       </w:r>
     </w:p>
     <w:p>
@@ -19,7 +19,6 @@
       <w:pPr>
         <w:pStyle w:val="ListBullet"/>
       </w:pPr>
-      <w:r/>
       <w:r>
         <w:rPr>
           <w:b/>
@@ -43,7 +42,6 @@
       <w:pPr>
         <w:pStyle w:val="ListBullet"/>
       </w:pPr>
-      <w:r/>
       <w:r>
         <w:rPr>
           <w:b/>
@@ -67,7 +65,6 @@
       <w:pPr>
         <w:pStyle w:val="ListBullet"/>
       </w:pPr>
-      <w:r/>
       <w:r>
         <w:rPr>
           <w:b/>
@@ -134,9 +131,6 @@
     </w:p>
     <w:p>
       <w:r>
-        <w:rPr>
-          <w:i/>
-        </w:rPr>
         <w:t xml:space="preserve">This is a </w:t>
       </w:r>
       <w:r>
@@ -151,7 +145,7 @@
     </w:p>
     <w:p>
       <w:pPr>
-        <w:pStyle w:val="Heading1"/>
+        <w:pStyle w:val="Heading2"/>
       </w:pPr>
       <w:r>
         <w:t>1. What FitcoachAI is</w:t>
@@ -161,7 +155,6 @@
       <w:pPr>
         <w:pStyle w:val="ListBullet"/>
       </w:pPr>
-      <w:r/>
       <w:r>
         <w:rPr>
           <w:b/>
@@ -176,7 +169,6 @@
       <w:pPr>
         <w:pStyle w:val="ListBullet"/>
       </w:pPr>
-      <w:r/>
       <w:r>
         <w:rPr>
           <w:b/>
@@ -200,7 +192,6 @@
       <w:pPr>
         <w:pStyle w:val="ListBullet"/>
       </w:pPr>
-      <w:r/>
       <w:r>
         <w:rPr>
           <w:b/>
@@ -215,7 +206,6 @@
       <w:pPr>
         <w:pStyle w:val="ListBullet"/>
       </w:pPr>
-      <w:r/>
       <w:r>
         <w:rPr>
           <w:b/>
@@ -230,7 +220,6 @@
       <w:pPr>
         <w:pStyle w:val="ListBullet"/>
       </w:pPr>
-      <w:r/>
       <w:r>
         <w:rPr>
           <w:b/>
@@ -263,7 +252,6 @@
       <w:pPr>
         <w:pStyle w:val="ListBullet"/>
       </w:pPr>
-      <w:r/>
       <w:r>
         <w:rPr>
           <w:b/>
@@ -276,7 +264,7 @@
     </w:p>
     <w:p>
       <w:pPr>
-        <w:pStyle w:val="Heading1"/>
+        <w:pStyle w:val="Heading2"/>
       </w:pPr>
       <w:r>
         <w:t>2. What was built, version by version</w:t>
@@ -323,6 +311,14 @@
           </w:tcPr>
           <w:p>
             <w:r>
+              <w:rPr>
+                <w:b/>
+              </w:rPr>
+            </w:r>
+            <w:r>
+              <w:rPr>
+                <w:b/>
+              </w:rPr>
               <w:t>Version</w:t>
             </w:r>
           </w:p>
@@ -333,6 +329,14 @@
           </w:tcPr>
           <w:p>
             <w:r>
+              <w:rPr>
+                <w:b/>
+              </w:rPr>
+            </w:r>
+            <w:r>
+              <w:rPr>
+                <w:b/>
+              </w:rPr>
               <w:t>Commit</w:t>
             </w:r>
           </w:p>
@@ -343,6 +347,14 @@
           </w:tcPr>
           <w:p>
             <w:r>
+              <w:rPr>
+                <w:b/>
+              </w:rPr>
+            </w:r>
+            <w:r>
+              <w:rPr>
+                <w:b/>
+              </w:rPr>
               <w:t>What</w:t>
             </w:r>
           </w:p>
@@ -354,6 +366,7 @@
             <w:tcW w:type="dxa" w:w="2880"/>
           </w:tcPr>
           <w:p>
+            <w:r/>
             <w:r>
               <w:t>v0.1</w:t>
             </w:r>
@@ -380,7 +393,6 @@
               </w:rPr>
               <w:t>eeacd31</w:t>
             </w:r>
-            <w:r/>
           </w:p>
         </w:tc>
         <w:tc>
@@ -388,6 +400,7 @@
             <w:tcW w:type="dxa" w:w="2880"/>
           </w:tcPr>
           <w:p>
+            <w:r/>
             <w:r>
               <w:t>Onboarding, health check, body map, voice baseline, 2-week plan; 3D coach (three.js + a Mixamo-derived Xbot, replaced in v0.7.1) and muscle-map highlighter.</w:t>
             </w:r>
@@ -400,6 +413,7 @@
             <w:tcW w:type="dxa" w:w="2880"/>
           </w:tcPr>
           <w:p>
+            <w:r/>
             <w:r>
               <w:t>v0.2</w:t>
             </w:r>
@@ -417,7 +431,6 @@
               </w:rPr>
               <w:t>6122bfc</w:t>
             </w:r>
-            <w:r/>
           </w:p>
         </w:tc>
         <w:tc>
@@ -425,6 +438,7 @@
             <w:tcW w:type="dxa" w:w="2880"/>
           </w:tcPr>
           <w:p>
+            <w:r/>
             <w:r>
               <w:t>App after onboarding: Today, session player, adaptive engine, calibration, decision log, reminders, simulated Apple Health, developer day simulation, research flags.</w:t>
             </w:r>
@@ -437,6 +451,7 @@
             <w:tcW w:type="dxa" w:w="2880"/>
           </w:tcPr>
           <w:p>
+            <w:r/>
             <w:r>
               <w:t>v0.3</w:t>
             </w:r>
@@ -447,6 +462,7 @@
             <w:tcW w:type="dxa" w:w="2880"/>
           </w:tcPr>
           <w:p>
+            <w:r/>
             <w:r>
               <w:t xml:space="preserve">(in </w:t>
             </w:r>
@@ -466,6 +482,7 @@
             <w:tcW w:type="dxa" w:w="2880"/>
           </w:tcPr>
           <w:p>
+            <w:r/>
             <w:r>
               <w:t>Integration review and polish; fixed a reload during Settings edits.</w:t>
             </w:r>
@@ -478,6 +495,7 @@
             <w:tcW w:type="dxa" w:w="2880"/>
           </w:tcPr>
           <w:p>
+            <w:r/>
             <w:r>
               <w:t>v0.4</w:t>
             </w:r>
@@ -504,7 +522,6 @@
               </w:rPr>
               <w:t>3d23fc5</w:t>
             </w:r>
-            <w:r/>
           </w:p>
         </w:tc>
         <w:tc>
@@ -512,6 +529,7 @@
             <w:tcW w:type="dxa" w:w="2880"/>
           </w:tcPr>
           <w:p>
+            <w:r/>
             <w:r>
               <w:t>Simpler: onboarding cut from 40 to 33 taps, bottom tabs, one-tap start, plain "what changed and why", weekly goal, UX audit.</w:t>
             </w:r>
@@ -524,6 +542,7 @@
             <w:tcW w:type="dxa" w:w="2880"/>
           </w:tcPr>
           <w:p>
+            <w:r/>
             <w:r>
               <w:t>v0.5</w:t>
             </w:r>
@@ -541,7 +560,6 @@
               </w:rPr>
               <w:t>16f0e96</w:t>
             </w:r>
-            <w:r/>
           </w:p>
         </w:tc>
         <w:tc>
@@ -549,6 +567,7 @@
             <w:tcW w:type="dxa" w:w="2880"/>
           </w:tcPr>
           <w:p>
+            <w:r/>
             <w:r>
               <w:t>Ready to try daily on iPhone: Stop button and spoken "stop" on every active screen; pause/resume after reload; installable offline PWA; iPhone fixes; backup restore; storage migration.</w:t>
             </w:r>
@@ -561,6 +580,7 @@
             <w:tcW w:type="dxa" w:w="2880"/>
           </w:tcPr>
           <w:p>
+            <w:r/>
             <w:r>
               <w:t>v0.5.2</w:t>
             </w:r>
@@ -578,7 +598,6 @@
               </w:rPr>
               <w:t>a86441e</w:t>
             </w:r>
-            <w:r/>
           </w:p>
         </w:tc>
         <w:tc>
@@ -586,6 +605,7 @@
             <w:tcW w:type="dxa" w:w="2880"/>
           </w:tcPr>
           <w:p>
+            <w:r/>
             <w:r>
               <w:t xml:space="preserve">iPhone hotfix: crash guard for a stale cached config.js, </w:t>
             </w:r>
@@ -607,6 +627,7 @@
             <w:tcW w:type="dxa" w:w="2880"/>
           </w:tcPr>
           <w:p>
+            <w:r/>
             <w:r>
               <w:t>v0.6.0</w:t>
             </w:r>
@@ -624,7 +645,6 @@
               </w:rPr>
               <w:t>f814396</w:t>
             </w:r>
-            <w:r/>
           </w:p>
         </w:tc>
         <w:tc>
@@ -632,6 +652,7 @@
             <w:tcW w:type="dxa" w:w="2880"/>
           </w:tcPr>
           <w:p>
+            <w:r/>
             <w:r>
               <w:t>Calibration phase: everyone starts at beginner level; data-driven "Getting to know you: X of 6 sessions" meter (no fixed day count); per-set timing; one-line reasons for ±1 changes; post-session check-in; Performance Score; plan built from calibration data; WebKit tests.</w:t>
             </w:r>
@@ -644,6 +665,7 @@
             <w:tcW w:type="dxa" w:w="2880"/>
           </w:tcPr>
           <w:p>
+            <w:r/>
             <w:r>
               <w:t>v0.7.1</w:t>
             </w:r>
@@ -661,7 +683,6 @@
               </w:rPr>
               <w:t>7fcb5b5</w:t>
             </w:r>
-            <w:r/>
           </w:p>
         </w:tc>
         <w:tc>
@@ -669,6 +690,7 @@
             <w:tcW w:type="dxa" w:w="2880"/>
           </w:tcPr>
           <w:p>
+            <w:r/>
             <w:r>
               <w:t>3D coach swapped to a CC0 Quaternius mannequin (366 KB, was the 2.93 MB Mixamo-derived Xbot). Idle animation only, as before.</w:t>
             </w:r>
@@ -681,6 +703,7 @@
             <w:tcW w:type="dxa" w:w="2880"/>
           </w:tcPr>
           <w:p>
+            <w:r/>
             <w:r>
               <w:t>v0.7.2</w:t>
             </w:r>
@@ -698,7 +721,6 @@
               </w:rPr>
               <w:t>8958a16</w:t>
             </w:r>
-            <w:r/>
           </w:p>
         </w:tc>
         <w:tc>
@@ -706,6 +728,7 @@
             <w:tcW w:type="dxa" w:w="2880"/>
           </w:tcPr>
           <w:p>
+            <w:r/>
             <w:r>
               <w:t>Polish: coach auto-framing, runtime palette tint, ground shadow, loading placeholder, fade-in, failure fallback, reduced motion; caption bar no longer hides Stop on iPhone SE; small layout fixes. Lighthouse numbers in UX-AUDIT.md.</w:t>
             </w:r>
@@ -718,6 +741,69 @@
             <w:tcW w:type="dxa" w:w="2880"/>
           </w:tcPr>
           <w:p>
+            <w:r/>
+            <w:r>
+              <w:t>v0.9.0</w:t>
+            </w:r>
+          </w:p>
+        </w:tc>
+        <w:tc>
+          <w:tcPr>
+            <w:tcW w:type="dxa" w:w="2880"/>
+          </w:tcPr>
+          <w:p>
+            <w:r/>
+            <w:r>
+              <w:t>(this release)</w:t>
+            </w:r>
+          </w:p>
+        </w:tc>
+        <w:tc>
+          <w:tcPr>
+            <w:tcW w:type="dxa" w:w="2880"/>
+          </w:tcPr>
+          <w:p>
+            <w:r/>
+            <w:r>
+              <w:t xml:space="preserve">Decision Round 1 applied: 35 approved values moved to </w:t>
+            </w:r>
+            <w:r>
+              <w:rPr>
+                <w:rFonts w:ascii="Courier New" w:hAnsi="Courier New"/>
+              </w:rPr>
+              <w:t>FC_CONFIG.APPROVED</w:t>
+            </w:r>
+            <w:r>
+              <w:t xml:space="preserve">, 9 items deferred; placeholder labels removed; R12 +15 s rest button; R25 repeat-skip note; OQ-18 health copy; OQ-1a interim C-section line; </w:t>
+            </w:r>
+            <w:r>
+              <w:rPr>
+                <w:rFonts w:ascii="Courier New" w:hAnsi="Courier New"/>
+              </w:rPr>
+              <w:t>R21-placeholder</w:t>
+            </w:r>
+            <w:r>
+              <w:t xml:space="preserve"> → </w:t>
+            </w:r>
+            <w:r>
+              <w:rPr>
+                <w:rFonts w:ascii="Courier New" w:hAnsi="Courier New"/>
+              </w:rPr>
+              <w:t>R21</w:t>
+            </w:r>
+            <w:r>
+              <w:t xml:space="preserve"> migration.</w:t>
+            </w:r>
+          </w:p>
+        </w:tc>
+      </w:tr>
+      <w:tr>
+        <w:tc>
+          <w:tcPr>
+            <w:tcW w:type="dxa" w:w="2880"/>
+          </w:tcPr>
+          <w:p>
+            <w:r/>
             <w:r>
               <w:t>v0.8.0</w:t>
             </w:r>
@@ -728,8 +814,9 @@
             <w:tcW w:type="dxa" w:w="2880"/>
           </w:tcPr>
           <w:p>
+            <w:r/>
             <w:r>
-              <w:t>(this release)</w:t>
+              <w:t>01d9eb7</w:t>
             </w:r>
           </w:p>
         </w:tc>
@@ -738,6 +825,7 @@
             <w:tcW w:type="dxa" w:w="2880"/>
           </w:tcPr>
           <w:p>
+            <w:r/>
             <w:r>
               <w:t xml:space="preserve">Sit-to-stand 3D demo (CC0 Quaternius </w:t>
             </w:r>
@@ -768,6 +856,7 @@
             <w:tcW w:type="dxa" w:w="2880"/>
           </w:tcPr>
           <w:p>
+            <w:r/>
             <w:r>
               <w:t>v0.7.0</w:t>
             </w:r>
@@ -794,7 +883,6 @@
               </w:rPr>
               <w:t>cbfc3aa</w:t>
             </w:r>
-            <w:r/>
           </w:p>
         </w:tc>
         <w:tc>
@@ -802,6 +890,7 @@
             <w:tcW w:type="dxa" w:w="2880"/>
           </w:tcPr>
           <w:p>
+            <w:r/>
             <w:r>
               <w:t>A "Hard" session or "Low" energy makes the next session lighter (same level, slightly lower target, can be declined). "Change something" (swap / skip / shorten with a reason, counter-offer first). "Why this workout" line. Root-cause fixes for two WebKit bugs; three.js vendored for offline use; lazy 3D; Lighthouse accessibility 95 → 100. Schema 4.</w:t>
             </w:r>
@@ -811,7 +900,7 @@
     </w:tbl>
     <w:p>
       <w:pPr>
-        <w:pStyle w:val="Heading1"/>
+        <w:pStyle w:val="Heading2"/>
       </w:pPr>
       <w:r>
         <w:t>3. How it was built</w:t>
@@ -819,7 +908,7 @@
     </w:p>
     <w:p>
       <w:pPr>
-        <w:pStyle w:val="Heading2"/>
+        <w:pStyle w:val="Heading3"/>
       </w:pPr>
       <w:r>
         <w:t>Process</w:t>
@@ -829,7 +918,6 @@
       <w:pPr>
         <w:pStyle w:val="ListNumber"/>
       </w:pPr>
-      <w:r/>
       <w:r>
         <w:rPr>
           <w:b/>
@@ -844,7 +932,6 @@
       <w:pPr>
         <w:pStyle w:val="ListNumber"/>
       </w:pPr>
-      <w:r/>
       <w:r>
         <w:rPr>
           <w:b/>
@@ -877,7 +964,6 @@
       <w:pPr>
         <w:pStyle w:val="ListNumber"/>
       </w:pPr>
-      <w:r/>
       <w:r>
         <w:rPr>
           <w:b/>
@@ -901,7 +987,6 @@
       <w:pPr>
         <w:pStyle w:val="ListNumber"/>
       </w:pPr>
-      <w:r/>
       <w:r>
         <w:rPr>
           <w:b/>
@@ -914,7 +999,7 @@
     </w:p>
     <w:p>
       <w:pPr>
-        <w:pStyle w:val="Heading2"/>
+        <w:pStyle w:val="Heading3"/>
       </w:pPr>
       <w:r>
         <w:t>Architecture</w:t>
@@ -1030,7 +1115,6 @@
       <w:pPr>
         <w:pStyle w:val="ListBullet"/>
       </w:pPr>
-      <w:r/>
       <w:r>
         <w:rPr>
           <w:rFonts w:ascii="Courier New" w:hAnsi="Courier New"/>
@@ -1063,7 +1147,6 @@
       <w:pPr>
         <w:pStyle w:val="ListBullet"/>
       </w:pPr>
-      <w:r/>
       <w:r>
         <w:rPr>
           <w:rFonts w:ascii="Courier New" w:hAnsi="Courier New"/>
@@ -1077,7 +1160,7 @@
         <w:rPr>
           <w:rFonts w:ascii="Courier New" w:hAnsi="Courier New"/>
         </w:rPr>
-        <w:t>fcai-v0.8.0</w:t>
+        <w:t>fcai-v0.9.0</w:t>
       </w:r>
       <w:r>
         <w:t>) that precaches the app, three.js and the 3D model.</w:t>
@@ -1085,7 +1168,7 @@
     </w:p>
     <w:p>
       <w:pPr>
-        <w:pStyle w:val="Heading2"/>
+        <w:pStyle w:val="Heading3"/>
       </w:pPr>
       <w:r>
         <w:t>File map</w:t>
@@ -1108,6 +1191,14 @@
           </w:tcPr>
           <w:p>
             <w:r>
+              <w:rPr>
+                <w:b/>
+              </w:rPr>
+            </w:r>
+            <w:r>
+              <w:rPr>
+                <w:b/>
+              </w:rPr>
               <w:t>Path</w:t>
             </w:r>
           </w:p>
@@ -1118,6 +1209,14 @@
           </w:tcPr>
           <w:p>
             <w:r>
+              <w:rPr>
+                <w:b/>
+              </w:rPr>
+            </w:r>
+            <w:r>
+              <w:rPr>
+                <w:b/>
+              </w:rPr>
               <w:t>Role</w:t>
             </w:r>
           </w:p>
@@ -1136,7 +1235,6 @@
               </w:rPr>
               <w:t>index.html</w:t>
             </w:r>
-            <w:r/>
           </w:p>
         </w:tc>
         <w:tc>
@@ -1144,6 +1242,7 @@
             <w:tcW w:type="dxa" w:w="4320"/>
           </w:tcPr>
           <w:p>
+            <w:r/>
             <w:r>
               <w:t xml:space="preserve">UI shell, CSS, </w:t>
             </w:r>
@@ -1190,7 +1289,6 @@
               </w:rPr>
               <w:t>js/config.js</w:t>
             </w:r>
-            <w:r/>
           </w:p>
         </w:tc>
         <w:tc>
@@ -1233,7 +1331,6 @@
               </w:rPr>
               <w:t>js/engine.js</w:t>
             </w:r>
-            <w:r/>
           </w:p>
         </w:tc>
         <w:tc>
@@ -1241,6 +1338,7 @@
             <w:tcW w:type="dxa" w:w="4320"/>
           </w:tcPr>
           <w:p>
+            <w:r/>
             <w:r>
               <w:t xml:space="preserve">Adaptation engine: </w:t>
             </w:r>
@@ -1350,7 +1448,6 @@
               </w:rPr>
               <w:t>js/app.js</w:t>
             </w:r>
-            <w:r/>
           </w:p>
         </w:tc>
         <w:tc>
@@ -1358,6 +1455,7 @@
             <w:tcW w:type="dxa" w:w="4320"/>
           </w:tcPr>
           <w:p>
+            <w:r/>
             <w:r>
               <w:t>Today, check-in and triage, session player, rest day, Learned, Settings, reminders, simulated Health, dev tools</w:t>
             </w:r>
@@ -1377,7 +1475,6 @@
               </w:rPr>
               <w:t>js/v05.js</w:t>
             </w:r>
-            <w:r/>
           </w:p>
         </w:tc>
         <w:tc>
@@ -1385,6 +1482,7 @@
             <w:tcW w:type="dxa" w:w="4320"/>
           </w:tcPr>
           <w:p>
+            <w:r/>
             <w:r>
               <w:t>Stop everywhere, pause/resume, PWA/update bar, backup export/restore, iPhone fixes</w:t>
             </w:r>
@@ -1404,7 +1502,6 @@
               </w:rPr>
               <w:t>js/v06.js</w:t>
             </w:r>
-            <w:r/>
           </w:p>
         </w:tc>
         <w:tc>
@@ -1412,6 +1509,7 @@
             <w:tcW w:type="dxa" w:w="4320"/>
           </w:tcPr>
           <w:p>
+            <w:r/>
             <w:r>
               <w:t>Calibration phase, set timing, post-session check-in, reason lines, Performance Score screen, plan-ready</w:t>
             </w:r>
@@ -1431,7 +1529,6 @@
               </w:rPr>
               <w:t>js/v07.js</w:t>
             </w:r>
-            <w:r/>
           </w:p>
         </w:tc>
         <w:tc>
@@ -1439,6 +1536,7 @@
             <w:tcW w:type="dxa" w:w="4320"/>
           </w:tcPr>
           <w:p>
+            <w:r/>
             <w:r>
               <w:t>Lighter next session, modification path, "Why this workout", migrated-user note, boot</w:t>
             </w:r>
@@ -1476,7 +1574,6 @@
               </w:rPr>
               <w:t>icons/</w:t>
             </w:r>
-            <w:r/>
           </w:p>
         </w:tc>
         <w:tc>
@@ -1484,6 +1581,7 @@
             <w:tcW w:type="dxa" w:w="4320"/>
           </w:tcPr>
           <w:p>
+            <w:r/>
             <w:r>
               <w:t>PWA</w:t>
             </w:r>
@@ -1503,7 +1601,6 @@
               </w:rPr>
               <w:t>assets/coach-mannequin.glb</w:t>
             </w:r>
-            <w:r/>
           </w:p>
         </w:tc>
         <w:tc>
@@ -1511,6 +1608,7 @@
             <w:tcW w:type="dxa" w:w="4320"/>
           </w:tcPr>
           <w:p>
+            <w:r/>
             <w:r>
               <w:t>3D mannequin (Quaternius, CC0): idle loop, plus stand-up/sit-down clips for the sit-to-stand demo</w:t>
             </w:r>
@@ -1539,7 +1637,6 @@
               </w:rPr>
               <w:t>vendor/rich-body-highlighter/</w:t>
             </w:r>
-            <w:r/>
           </w:p>
         </w:tc>
         <w:tc>
@@ -1547,6 +1644,7 @@
             <w:tcW w:type="dxa" w:w="4320"/>
           </w:tcPr>
           <w:p>
+            <w:r/>
             <w:r>
               <w:t>Vendored MIT libraries with their LICENSE files</w:t>
             </w:r>
@@ -1566,7 +1664,6 @@
               </w:rPr>
               <w:t>tests/</w:t>
             </w:r>
-            <w:r/>
           </w:p>
         </w:tc>
         <w:tc>
@@ -1574,6 +1671,7 @@
             <w:tcW w:type="dxa" w:w="4320"/>
           </w:tcPr>
           <w:p>
+            <w:r/>
             <w:r>
               <w:t>Playwright scripts (see below)</w:t>
             </w:r>
@@ -1620,7 +1718,6 @@
               </w:rPr>
               <w:t>docs/</w:t>
             </w:r>
-            <w:r/>
           </w:p>
         </w:tc>
         <w:tc>
@@ -1628,6 +1725,7 @@
             <w:tcW w:type="dxa" w:w="4320"/>
           </w:tcPr>
           <w:p>
+            <w:r/>
             <w:r>
               <w:t>Documentation</w:t>
             </w:r>
@@ -1637,7 +1735,7 @@
     </w:tbl>
     <w:p>
       <w:pPr>
-        <w:pStyle w:val="Heading2"/>
+        <w:pStyle w:val="Heading3"/>
       </w:pPr>
       <w:r>
         <w:t>Data model and migrations</w:t>
@@ -1647,7 +1745,6 @@
       <w:pPr>
         <w:pStyle w:val="ListBullet"/>
       </w:pPr>
-      <w:r/>
       <w:r>
         <w:rPr>
           <w:rFonts w:ascii="Courier New" w:hAnsi="Courier New"/>
@@ -1725,7 +1822,6 @@
       <w:pPr>
         <w:pStyle w:val="ListBullet"/>
       </w:pPr>
-      <w:r/>
       <w:r>
         <w:rPr>
           <w:rFonts w:ascii="Courier New" w:hAnsi="Courier New"/>
@@ -1740,7 +1836,6 @@
       <w:pPr>
         <w:pStyle w:val="ListBullet"/>
       </w:pPr>
-      <w:r/>
       <w:r>
         <w:rPr>
           <w:rFonts w:ascii="Courier New" w:hAnsi="Courier New"/>
@@ -1806,7 +1901,7 @@
     </w:p>
     <w:p>
       <w:pPr>
-        <w:pStyle w:val="Heading2"/>
+        <w:pStyle w:val="Heading3"/>
       </w:pPr>
       <w:r>
         <w:t>Engine rules (see `js/engine.js` `applySession`, ~lines 67–117, and the `MSG` table)</w:t>
@@ -1858,7 +1953,6 @@
       <w:pPr>
         <w:pStyle w:val="ListBullet"/>
       </w:pPr>
-      <w:r/>
       <w:r>
         <w:rPr>
           <w:b/>
@@ -1900,7 +1994,6 @@
       <w:pPr>
         <w:pStyle w:val="ListBullet"/>
       </w:pPr>
-      <w:r/>
       <w:r>
         <w:rPr>
           <w:b/>
@@ -1933,7 +2026,6 @@
       <w:pPr>
         <w:pStyle w:val="ListBullet"/>
       </w:pPr>
-      <w:r/>
       <w:r>
         <w:rPr>
           <w:b/>
@@ -1998,7 +2090,7 @@
     </w:p>
     <w:p>
       <w:pPr>
-        <w:pStyle w:val="Heading2"/>
+        <w:pStyle w:val="Heading3"/>
       </w:pPr>
       <w:r>
         <w:t>Tests and how to run them</w:t>
@@ -2008,7 +2100,7 @@
       <w:r>
         <w:rPr>
           <w:rFonts w:ascii="Courier New" w:hAnsi="Courier New"/>
-          <w:sz w:val="18"/>
+          <w:sz w:val="16"/>
         </w:rPr>
         <w:t>python3 -m http.server 8765            # in the repo root</w:t>
       </w:r>
@@ -2017,7 +2109,7 @@
       <w:r>
         <w:rPr>
           <w:rFonts w:ascii="Courier New" w:hAnsi="Courier New"/>
-          <w:sz w:val="18"/>
+          <w:sz w:val="16"/>
         </w:rPr>
         <w:t>npm i -g playwright-core               # tests use playwright-core + system Chrome (/usr/bin/google-chrome)</w:t>
       </w:r>
@@ -2026,7 +2118,7 @@
       <w:r>
         <w:rPr>
           <w:rFonts w:ascii="Courier New" w:hAnsi="Courier New"/>
-          <w:sz w:val="18"/>
+          <w:sz w:val="16"/>
         </w:rPr>
         <w:t>export NODE_PATH=$(npm root -g)</w:t>
       </w:r>
@@ -2035,7 +2127,7 @@
       <w:r>
         <w:rPr>
           <w:rFonts w:ascii="Courier New" w:hAnsi="Courier New"/>
-          <w:sz w:val="18"/>
+          <w:sz w:val="16"/>
         </w:rPr>
         <w:t>node tests/v07.js http://localhost:8765/</w:t>
       </w:r>
@@ -2044,7 +2136,7 @@
       <w:r>
         <w:rPr>
           <w:rFonts w:ascii="Courier New" w:hAnsi="Courier New"/>
-          <w:sz w:val="18"/>
+          <w:sz w:val="16"/>
         </w:rPr>
         <w:t>BROWSER=webkit node tests/v07.js http://localhost:8765/   # WebKit; WEBKIT_PATH overrides the binary (tests/launch.js)</w:t>
       </w:r>
@@ -2111,6 +2203,15 @@
         <w:rPr>
           <w:rFonts w:ascii="Courier New" w:hAnsi="Courier New"/>
         </w:rPr>
+        <w:t>v090.js</w:t>
+      </w:r>
+      <w:r>
+        <w:t xml:space="preserve">, </w:t>
+      </w:r>
+      <w:r>
+        <w:rPr>
+          <w:rFonts w:ascii="Courier New" w:hAnsi="Courier New"/>
+        </w:rPr>
         <w:t>v06.js</w:t>
       </w:r>
       <w:r>
@@ -2133,6 +2234,64 @@
       </w:r>
       <w:r>
         <w:t xml:space="preserve"> (3D coach reduced motion / fit / fallback, caption bar vs Stop). At v0.7.2 all 8 suites passed on Chromium and WebKit. At v0.7.0 all passed on Chromium and WebKit: v07 28, v06 29, v05 32, ui 32, test 28, inv 18, audit 34 taps / 15 screens.</w:t>
+      </w:r>
+    </w:p>
+    <w:p>
+      <w:pPr>
+        <w:pStyle w:val="Heading3"/>
+      </w:pPr>
+      <w:r>
+        <w:t>Developer tools (`?dev=1`)</w:t>
+      </w:r>
+    </w:p>
+    <w:p>
+      <w:r>
+        <w:t xml:space="preserve">On Today: </w:t>
+      </w:r>
+      <w:r>
+        <w:rPr>
+          <w:b/>
+        </w:rPr>
+        <w:t>+1 day / +7 days</w:t>
+      </w:r>
+      <w:r>
+        <w:t xml:space="preserve"> (moves the app clock), </w:t>
+      </w:r>
+      <w:r>
+        <w:rPr>
+          <w:b/>
+        </w:rPr>
+        <w:t>Auto-play 14 days</w:t>
+      </w:r>
+      <w:r>
+        <w:t xml:space="preserve"> (synthetic workouts), </w:t>
+      </w:r>
+      <w:r>
+        <w:rPr>
+          <w:b/>
+        </w:rPr>
+        <w:t>Auto-play 6 sessions</w:t>
+      </w:r>
+      <w:r>
+        <w:t xml:space="preserve"> (clean or messy calibration), </w:t>
+      </w:r>
+      <w:r>
+        <w:rPr>
+          <w:b/>
+        </w:rPr>
+        <w:t>Real date</w:t>
+      </w:r>
+      <w:r>
+        <w:t xml:space="preserve">, and </w:t>
+      </w:r>
+      <w:r>
+        <w:rPr>
+          <w:b/>
+        </w:rPr>
+        <w:t>Fast timers</w:t>
+      </w:r>
+      <w:r>
+        <w:t>. Tap the version line in Settings for more. Simulated data is tagged in the log.</w:t>
       </w:r>
     </w:p>
     <w:p>
@@ -2140,65 +2299,199 @@
         <w:pStyle w:val="Heading2"/>
       </w:pPr>
       <w:r>
-        <w:t>Developer tools (`?dev=1`)</w:t>
+        <w:t>4. The plan ahead</w:t>
       </w:r>
     </w:p>
     <w:p>
-      <w:r>
-        <w:t xml:space="preserve">On Today: </w:t>
-      </w:r>
+      <w:pPr>
+        <w:pStyle w:val="Heading3"/>
+      </w:pPr>
+      <w:r>
+        <w:t>Open placeholders (`RESEARCH-FLAGS.md`; config `FC_CONFIG.RESEARCH_NEEDED`)</w:t>
+      </w:r>
+    </w:p>
+    <w:p>
+      <w:pPr>
+        <w:pStyle w:val="ListBullet"/>
+      </w:pPr>
       <w:r>
         <w:rPr>
           <w:b/>
         </w:rPr>
-        <w:t>+1 day / +7 days</w:t>
-      </w:r>
-      <w:r>
-        <w:t xml:space="preserve"> (moves the app clock), </w:t>
-      </w:r>
+        <w:t>Dose and progression:</w:t>
+      </w:r>
+      <w:r>
+        <w:t xml:space="preserve"> R1 rep/hold/time ranges and sets; R2 ladder levels (4); R3 clean sessions before step-up, rep increment; R4 bad-session thresholds; R5 anti-thrash gap; R6 plateau responses; R7 gentle-mode cap and spacing; R12 rest between sets.</w:t>
+      </w:r>
+    </w:p>
+    <w:p>
+      <w:pPr>
+        <w:pStyle w:val="ListBullet"/>
+      </w:pPr>
       <w:r>
         <w:rPr>
           <w:b/>
         </w:rPr>
-        <w:t>Auto-play 14 days</w:t>
-      </w:r>
-      <w:r>
-        <w:t xml:space="preserve"> (synthetic workouts), </w:t>
-      </w:r>
+        <w:t>Day-to-day:</w:t>
+      </w:r>
+      <w:r>
+        <w:t xml:space="preserve"> R10 check-in triage; R11 check-in pain effects; R13 short-sleep threshold; R14 default nudge time; R15 short-session offer; R16 weekly goal and streak; R17 one-tap start meaning; R18 onboarding defaults.</w:t>
+      </w:r>
+    </w:p>
+    <w:p>
+      <w:pPr>
+        <w:pStyle w:val="ListBullet"/>
+      </w:pPr>
       <w:r>
         <w:rPr>
           <w:b/>
         </w:rPr>
-        <w:t>Auto-play 6 sessions</w:t>
-      </w:r>
-      <w:r>
-        <w:t xml:space="preserve"> (clean or messy calibration), </w:t>
-      </w:r>
+        <w:t>Calibration and scoring:</w:t>
+      </w:r>
+      <w:r>
+        <w:t xml:space="preserve"> R19 when calibration ends (R8 superseded); R20 beginner starting steps; R21 Performance Score formula (R9 superseded for display); R22 "finished fast" cue.</w:t>
+      </w:r>
+    </w:p>
+    <w:p>
+      <w:pPr>
+        <w:pStyle w:val="ListBullet"/>
+      </w:pPr>
       <w:r>
         <w:rPr>
           <w:b/>
         </w:rPr>
-        <w:t>Real date</w:t>
-      </w:r>
-      <w:r>
-        <w:t xml:space="preserve">, and </w:t>
-      </w:r>
+        <w:t>v0.7:</w:t>
+      </w:r>
+      <w:r>
+        <w:t xml:space="preserve"> R23 post-session effects including the lighter next session; R24 experience → tone only; R25 modification path; R26 days-per-week suggestion.</w:t>
+      </w:r>
+    </w:p>
+    <w:p>
+      <w:pPr>
+        <w:pStyle w:val="ListBullet"/>
+      </w:pPr>
       <w:r>
         <w:rPr>
           <w:b/>
         </w:rPr>
-        <w:t>Fast timers</w:t>
-      </w:r>
-      <w:r>
-        <w:t>. Tap the version line in Settings for more. Simulated data is tagged in the log.</w:t>
+        <w:t>v0.8.0:</w:t>
+      </w:r>
+      <w:r>
+        <w:t xml:space="preserve"> X9 demo animations needed (every exercise except sit-to-stand). Decisions for all open items are in </w:t>
+      </w:r>
+      <w:r>
+        <w:rPr>
+          <w:rFonts w:ascii="Courier New" w:hAnsi="Courier New"/>
+        </w:rPr>
+        <w:t>docs/DECISION-ROUND-1.md</w:t>
+      </w:r>
+      <w:r>
+        <w:t>.</w:t>
       </w:r>
     </w:p>
     <w:p>
       <w:pPr>
-        <w:pStyle w:val="Heading1"/>
+        <w:pStyle w:val="ListBullet"/>
       </w:pPr>
       <w:r>
-        <w:t>4. The plan ahead</w:t>
+        <w:rPr>
+          <w:b/>
+        </w:rPr>
+        <w:t>v0.9.0:</w:t>
+      </w:r>
+      <w:r>
+        <w:t xml:space="preserve"> Decision Round 1 approved 27 Oct 2026. Still open (deferred): X6, X9, R24, OQ-1a, OQ-5, OQ-15, OQ-11, OQ-12, OQ-16. Pre-launch reviews still required for R7, OQ-17, R11, X2, X8, R17, OQ-13.</w:t>
+      </w:r>
+    </w:p>
+    <w:p>
+      <w:pPr>
+        <w:pStyle w:val="ListBullet"/>
+      </w:pPr>
+      <w:r>
+        <w:rPr>
+          <w:b/>
+        </w:rPr>
+        <w:t>v0.7.1:</w:t>
+      </w:r>
+      <w:r>
+        <w:t xml:space="preserve"> X8 look of the 3D coach (placeholder art). In v0.7.2 it is tinted to the app palette at runtime only; the CC0 file is unchanged.</w:t>
+      </w:r>
+    </w:p>
+    <w:p>
+      <w:pPr>
+        <w:pStyle w:val="ListBullet"/>
+      </w:pPr>
+      <w:r>
+        <w:rPr>
+          <w:b/>
+        </w:rPr>
+        <w:t>Code heuristics:</w:t>
+      </w:r>
+      <w:r>
+        <w:t xml:space="preserve"> X1 evidence tiers; X2 tolerance labels; X3 rest-day touchpoint; X4 measure-chip ranges; X5 step-up verification; X6 injury flag from onboarding; X7 reminder demo.</w:t>
+      </w:r>
+    </w:p>
+    <w:p>
+      <w:pPr>
+        <w:pStyle w:val="Heading3"/>
+      </w:pPr>
+      <w:r>
+        <w:t>11 open questions in the onboarding spec (§7.1)</w:t>
+      </w:r>
+    </w:p>
+    <w:p>
+      <w:r>
+        <w:t>OQ-1a pelvic-floor physio review of the postpartum rules; OQ-5 legal and clinical sign-off and localisation of the safety wording; OQ-6b whether people 70+ default to gentle mode; OQ-9 holidays (locale vs Calendar access); OQ-11 backups/export; OQ-12 optional first name for voice; OQ-13 voice reliability in noisy homes; OQ-15 regulatory positioning (general wellness) and App Store rules; OQ-16 screen count; OQ-17 gentle-mode details; OQ-18 Apple Health read types.</w:t>
+      </w:r>
+    </w:p>
+    <w:p>
+      <w:pPr>
+        <w:pStyle w:val="Heading3"/>
+      </w:pPr>
+      <w:r>
+        <w:t>Next steps</w:t>
+      </w:r>
+    </w:p>
+    <w:p>
+      <w:pPr>
+        <w:pStyle w:val="ListBullet"/>
+      </w:pPr>
+      <w:r>
+        <w:rPr>
+          <w:b/>
+        </w:rPr>
+        <w:t>Native SwiftUI app.</w:t>
+      </w:r>
+      <w:r>
+        <w:t xml:space="preserve"> The prototype logic (engine, config, copy) is the reference to port. The web-specific parts (service worker, Safari workarounds, localStorage) do not carry over.</w:t>
+      </w:r>
+    </w:p>
+    <w:p>
+      <w:pPr>
+        <w:pStyle w:val="ListBullet"/>
+      </w:pPr>
+      <w:r>
+        <w:rPr>
+          <w:b/>
+        </w:rPr>
+        <w:t>Real-iPhone testing.</w:t>
+      </w:r>
+      <w:r>
+        <w:t xml:space="preserve"> All automated testing so far is Playwright Chromium and WebKit; nothing is verified on a physical iPhone. Check voice, audio unlock, wake lock, Home Screen storage, the offline update flow and 3D performance.</w:t>
+      </w:r>
+    </w:p>
+    <w:p>
+      <w:pPr>
+        <w:pStyle w:val="ListBullet"/>
+      </w:pPr>
+      <w:r>
+        <w:rPr>
+          <w:b/>
+        </w:rPr>
+        <w:t>Expert review</w:t>
+      </w:r>
+      <w:r>
+        <w:t xml:space="preserve"> of placeholders and safety: coach / sports science, physio (including pelvic floor), clinical and legal.</w:t>
       </w:r>
     </w:p>
     <w:p>
@@ -2206,121 +2499,328 @@
         <w:pStyle w:val="Heading2"/>
       </w:pPr>
       <w:r>
-        <w:t>Open placeholders (`RESEARCH-FLAGS.md`; config `FC_CONFIG.RESEARCH_NEEDED`)</w:t>
+        <w:t>5. What to look for — prioritised audit checklist</w:t>
+      </w:r>
+    </w:p>
+    <w:p>
+      <w:r>
+        <w:rPr>
+          <w:b/>
+        </w:rPr>
+        <w:t>P0 — Safety</w:t>
+      </w:r>
+    </w:p>
+    <w:p>
+      <w:pPr>
+        <w:pStyle w:val="ListNumber"/>
+      </w:pPr>
+      <w:r>
+        <w:t xml:space="preserve">The </w:t>
+      </w:r>
+      <w:r>
+        <w:rPr>
+          <w:rFonts w:ascii="Courier New" w:hAnsi="Courier New"/>
+        </w:rPr>
+        <w:t>SAFE</w:t>
+      </w:r>
+      <w:r>
+        <w:t xml:space="preserve"> statements in </w:t>
+      </w:r>
+      <w:r>
+        <w:rPr>
+          <w:rFonts w:ascii="Courier New" w:hAnsi="Courier New"/>
+        </w:rPr>
+        <w:t>index.html</w:t>
+      </w:r>
+      <w:r>
+        <w:t xml:space="preserve"> are word for word with spec §0.1 and appear wherever the spec requires them (health-check stops, pain, during sessions, food).</w:t>
+      </w:r>
+    </w:p>
+    <w:p>
+      <w:pPr>
+        <w:pStyle w:val="ListNumber"/>
+      </w:pPr>
+      <w:r>
+        <w:t>Health-check logic: "not sure" counts as yes; stop screens for under 18, chest pain, fainting, pregnancy and the other spec stops (</w:t>
+      </w:r>
+      <w:r>
+        <w:rPr>
+          <w:rFonts w:ascii="Courier New" w:hAnsi="Courier New"/>
+        </w:rPr>
+        <w:t>tests/test.js</w:t>
+      </w:r>
+      <w:r>
+        <w:t xml:space="preserve"> covers four).</w:t>
+      </w:r>
+    </w:p>
+    <w:p>
+      <w:pPr>
+        <w:pStyle w:val="ListNumber"/>
+      </w:pPr>
+      <w:r>
+        <w:t>A Stop button and spoken "stop" on every active exercise screen; sharp pain ends the session.</w:t>
+      </w:r>
+    </w:p>
+    <w:p>
+      <w:pPr>
+        <w:pStyle w:val="ListNumber"/>
+      </w:pPr>
+      <w:r>
+        <w:t>Pain paths (check-in, during the set, post-session, modification reason "pain", in-session skip with pain) all put the pattern on hold and never swap a painful movement for another.</w:t>
+      </w:r>
+    </w:p>
+    <w:p>
+      <w:pPr>
+        <w:pStyle w:val="ListNumber"/>
+      </w:pPr>
+      <w:r>
+        <w:t>Postpartum and gentle-mode rules match the spec and the locked doc.</w:t>
+      </w:r>
+    </w:p>
+    <w:p>
+      <w:r>
+        <w:rPr>
+          <w:b/>
+        </w:rPr>
+        <w:t>P0 — Engine invariants</w:t>
+      </w:r>
+      <w:r>
+        <w:t xml:space="preserve"> (</w:t>
+      </w:r>
+      <w:r>
+        <w:rPr>
+          <w:rFonts w:ascii="Courier New" w:hAnsi="Courier New"/>
+        </w:rPr>
+        <w:t>js/engine.js</w:t>
+      </w:r>
+      <w:r>
+        <w:t xml:space="preserve">, </w:t>
+      </w:r>
+      <w:r>
+        <w:rPr>
+          <w:rFonts w:ascii="Courier New" w:hAnsi="Courier New"/>
+        </w:rPr>
+        <w:t>tests/inv.js</w:t>
+      </w:r>
+      <w:r>
+        <w:t>)</w:t>
+      </w:r>
+    </w:p>
+    <w:p>
+      <w:pPr>
+        <w:pStyle w:val="ListNumber"/>
+      </w:pPr>
+      <w:r>
+        <w:t>A level never changes by more than 1 per session; one bad day never lowers a level; the injury gate requires 3 pain-free sessions over at least 7 days, with no instant clearance; gentle-mode caps hold; short, lighter and swapped sessions never move a level; the engine is pure.</w:t>
+      </w:r>
+    </w:p>
+    <w:p>
+      <w:r>
+        <w:rPr>
+          <w:b/>
+        </w:rPr>
+        <w:t>P1 — Conformance with the locked doc</w:t>
+      </w:r>
+    </w:p>
+    <w:p>
+      <w:pPr>
+        <w:pStyle w:val="ListNumber"/>
+      </w:pPr>
+      <w:r>
+        <w:t xml:space="preserve">Compare </w:t>
+      </w:r>
+      <w:r>
+        <w:rPr>
+          <w:rFonts w:ascii="Courier New" w:hAnsi="Courier New"/>
+        </w:rPr>
+        <w:t>docs/CORE-PRODUCT-LOGICS.docx</w:t>
+      </w:r>
+      <w:r>
+        <w:t xml:space="preserve"> and the APPROVED items in the spec against what the code does. Anything not in the doc should be a labelled placeholder, not hard-coded.</w:t>
+      </w:r>
+    </w:p>
+    <w:p>
+      <w:r>
+        <w:rPr>
+          <w:b/>
+        </w:rPr>
+        <w:t>P1 — Data integrity</w:t>
+      </w:r>
+    </w:p>
+    <w:p>
+      <w:pPr>
+        <w:pStyle w:val="ListNumber"/>
+      </w:pPr>
+      <w:r>
+        <w:rPr>
+          <w:rFonts w:ascii="Courier New" w:hAnsi="Courier New"/>
+        </w:rPr>
+        <w:t>migrateState</w:t>
+      </w:r>
+      <w:r>
+        <w:t xml:space="preserve"> handles schemas 1→4 without losing data; the event log is append-only; export and restore round-trip correctly; reload or resume mid-workout and mid-check-in works.</w:t>
+      </w:r>
+    </w:p>
+    <w:p>
+      <w:r>
+        <w:rPr>
+          <w:b/>
+        </w:rPr>
+        <w:t>P1 — Privacy</w:t>
+      </w:r>
+    </w:p>
+    <w:p>
+      <w:pPr>
+        <w:pStyle w:val="ListNumber"/>
+      </w:pPr>
+      <w:r>
+        <w:t>No network calls with user data. The only network use should be loading the app's own files (now same-origin). No analytics. The S2 privacy copy matches the behaviour.</w:t>
+      </w:r>
+    </w:p>
+    <w:p>
+      <w:r>
+        <w:rPr>
+          <w:b/>
+        </w:rPr>
+        <w:t>P1 — Honest copy</w:t>
+      </w:r>
+    </w:p>
+    <w:p>
+      <w:pPr>
+        <w:pStyle w:val="ListNumber"/>
+      </w:pPr>
+      <w:r>
+        <w:t>No outcome or timeline promises; plain language (grade 6–8, no jargon); "placeholder" labels visible; food guidance general only.</w:t>
+      </w:r>
+    </w:p>
+    <w:p>
+      <w:r>
+        <w:rPr>
+          <w:b/>
+        </w:rPr>
+        <w:t>P2 — Licenses</w:t>
+      </w:r>
+    </w:p>
+    <w:p>
+      <w:pPr>
+        <w:pStyle w:val="ListNumber"/>
+      </w:pPr>
+      <w:r>
+        <w:t>three.js (MIT), rich-body-highlighter (MIT) and coach-mannequin.glb (Quaternius, CC0, see README credits). Check that no other assets lack a license.</w:t>
+      </w:r>
+    </w:p>
+    <w:p>
+      <w:r>
+        <w:rPr>
+          <w:b/>
+        </w:rPr>
+        <w:t>P2 — Accessibility</w:t>
+      </w:r>
+    </w:p>
+    <w:p>
+      <w:pPr>
+        <w:pStyle w:val="ListNumber"/>
+      </w:pPr>
+      <w:r>
+        <w:t>Tap targets of at least 44 px, contrast, labels and roles on chip groups, screen-reader flow. Lighthouse accessibility is 100 at v0.7.0.</w:t>
+      </w:r>
+    </w:p>
+    <w:p>
+      <w:r>
+        <w:rPr>
+          <w:b/>
+        </w:rPr>
+        <w:t>P2 — iOS Safari behaviour</w:t>
+      </w:r>
+    </w:p>
+    <w:p>
+      <w:pPr>
+        <w:pStyle w:val="ListNumber"/>
+      </w:pPr>
+      <w:r>
+        <w:t>Safe areas, the floating toolbar, 16 px inputs, speech (synthesis and recognition availability), the service worker update bar, and Home Screen storage separate from Safari.</w:t>
+      </w:r>
+    </w:p>
+    <w:p>
+      <w:r>
+        <w:rPr>
+          <w:b/>
+        </w:rPr>
+        <w:t>P2 — Test coverage gaps</w:t>
+      </w:r>
+    </w:p>
+    <w:p>
+      <w:pPr>
+        <w:pStyle w:val="ListNumber"/>
+      </w:pPr>
+      <w:r>
+        <w:t>Known gaps: no real-device tests; speech recognition is faked in tests; not every spec stop path or region-to-pattern mapping is covered; 3D is checked only for render and offline; no fuzzing of imported backups beyond the basic invalid cases.</w:t>
+      </w:r>
+    </w:p>
+    <w:p>
+      <w:r>
+        <w:rPr>
+          <w:b/>
+        </w:rPr>
+        <w:t>Known uncertainties (from the v0.6 and v0.7 reports)</w:t>
       </w:r>
     </w:p>
     <w:p>
       <w:pPr>
         <w:pStyle w:val="ListBullet"/>
       </w:pPr>
-      <w:r/>
-      <w:r>
-        <w:rPr>
-          <w:b/>
-        </w:rPr>
-        <w:t>Dose and progression:</w:t>
-      </w:r>
-      <w:r>
-        <w:t xml:space="preserve"> R1 rep/hold/time ranges and sets; R2 ladder levels (4); R3 clean sessions before step-up, rep increment; R4 bad-session thresholds; R5 anti-thrash gap; R6 plateau responses; R7 gentle-mode cap and spacing; R12 rest between sets.</w:t>
+      <w:r>
+        <w:t>Lighter sessions do not count towards finishing calibration, so it can take slightly longer (R23).</w:t>
       </w:r>
     </w:p>
     <w:p>
       <w:pPr>
         <w:pStyle w:val="ListBullet"/>
       </w:pPr>
-      <w:r/>
-      <w:r>
-        <w:rPr>
-          <w:b/>
-        </w:rPr>
-        <w:t>Day-to-day:</w:t>
-      </w:r>
-      <w:r>
-        <w:t xml:space="preserve"> R10 check-in triage; R11 check-in pain effects; R13 short-sleep threshold; R14 default nudge time; R15 short-session offer; R16 weekly goal and streak; R17 one-tap start meaning; R18 onboarding defaults.</w:t>
+      <w:r>
+        <w:t>Pain during a modification puts the movement on hold. That is consistent with the check-in pain rule, but it has had no clinical review.</w:t>
       </w:r>
     </w:p>
     <w:p>
       <w:pPr>
         <w:pStyle w:val="ListBullet"/>
       </w:pPr>
-      <w:r/>
-      <w:r>
-        <w:rPr>
-          <w:b/>
-        </w:rPr>
-        <w:t>Calibration and scoring:</w:t>
-      </w:r>
-      <w:r>
-        <w:t xml:space="preserve"> R19 when calibration ends (R8 superseded); R20 beginner starting steps; R21 Performance Score formula (R9 superseded for display); R22 "finished fast" cue.</w:t>
+      <w:r>
+        <w:t>Lighthouse performance is about 71 because the 3D coach dominates blocking time in headless Chrome. Real iPhone performance is unmeasured.</w:t>
       </w:r>
     </w:p>
     <w:p>
       <w:pPr>
         <w:pStyle w:val="ListBullet"/>
       </w:pPr>
-      <w:r/>
-      <w:r>
-        <w:rPr>
-          <w:b/>
-        </w:rPr>
-        <w:t>v0.7:</w:t>
-      </w:r>
-      <w:r>
-        <w:t xml:space="preserve"> R23 post-session effects including the lighter next session; R24 experience → tone only; R25 modification path; R26 days-per-week suggestion.</w:t>
+      <w:r>
+        <w:t>Every threshold in R1–R26 and X1–X8 is a placeholder without expert validation.</w:t>
       </w:r>
     </w:p>
     <w:p>
       <w:pPr>
         <w:pStyle w:val="ListBullet"/>
       </w:pPr>
-      <w:r/>
-      <w:r>
-        <w:rPr>
-          <w:b/>
-        </w:rPr>
-        <w:t>v0.8.0:</w:t>
-      </w:r>
-      <w:r>
-        <w:t xml:space="preserve"> X9 demo animations needed (every exercise except sit-to-stand). Decisions for all open items are in </w:t>
+      <w:r>
+        <w:t>Override layering (</w:t>
       </w:r>
       <w:r>
         <w:rPr>
           <w:rFonts w:ascii="Courier New" w:hAnsi="Courier New"/>
         </w:rPr>
-        <w:t>docs/DECISION-ROUND-1.md</w:t>
-      </w:r>
-      <w:r>
-        <w:t>.</w:t>
-      </w:r>
-    </w:p>
-    <w:p>
-      <w:pPr>
-        <w:pStyle w:val="ListBullet"/>
-      </w:pPr>
-      <w:r/>
+        <w:t>v05</w:t>
+      </w:r>
+      <w:r>
+        <w:t xml:space="preserve"> → </w:t>
+      </w:r>
       <w:r>
         <w:rPr>
-          <w:b/>
+          <w:rFonts w:ascii="Courier New" w:hAnsi="Courier New"/>
         </w:rPr>
-        <w:t>v0.7.1:</w:t>
-      </w:r>
-      <w:r>
-        <w:t xml:space="preserve"> X8 look of the 3D coach (placeholder art). In v0.7.2 it is tinted to the app palette at runtime only; the CC0 file is unchanged.</w:t>
-      </w:r>
-    </w:p>
-    <w:p>
-      <w:pPr>
-        <w:pStyle w:val="ListBullet"/>
-      </w:pPr>
-      <w:r/>
-      <w:r>
-        <w:rPr>
-          <w:b/>
-        </w:rPr>
-        <w:t>Code heuristics:</w:t>
-      </w:r>
-      <w:r>
-        <w:t xml:space="preserve"> X1 evidence tiers; X2 tolerance labels; X3 rest-day touchpoint; X4 measure-chip ranges; X5 step-up verification; X6 injury flag from onboarding; X7 reminder demo.</w:t>
+        <w:t>v07</w:t>
+      </w:r>
+      <w:r>
+        <w:t>) makes the call order non-obvious. It is a refactor candidate before porting.</w:t>
       </w:r>
     </w:p>
     <w:p>
@@ -2328,574 +2828,157 @@
         <w:pStyle w:val="Heading2"/>
       </w:pPr>
       <w:r>
-        <w:t>11 open questions in the onboarding spec (§7.1)</w:t>
+        <w:t>6. Prompt for Claude (paste as is)</w:t>
       </w:r>
     </w:p>
     <w:p>
       <w:r>
-        <w:t>OQ-1a pelvic-floor physio review of the postpartum rules; OQ-5 legal and clinical sign-off and localisation of the safety wording; OQ-6b whether people 70+ default to gentle mode; OQ-9 holidays (locale vs Calendar access); OQ-11 backups/export; OQ-12 optional first name for voice; OQ-13 voice reliability in noisy homes; OQ-15 regulatory positioning (general wellness) and App Store rules; OQ-16 screen count; OQ-17 gentle-mode details; OQ-18 Apple Health read types.</w:t>
+        <w:rPr>
+          <w:rFonts w:ascii="Courier New" w:hAnsi="Courier New"/>
+          <w:sz w:val="16"/>
+        </w:rPr>
+        <w:t>You are auditing FitcoachAI, a draft fitness-coaching prototype (reference only, not medical advice).</w:t>
       </w:r>
     </w:p>
     <w:p>
-      <w:pPr>
-        <w:pStyle w:val="Heading2"/>
-      </w:pPr>
-      <w:r>
-        <w:t>Next steps</w:t>
+      <w:r>
+        <w:rPr>
+          <w:rFonts w:ascii="Courier New" w:hAnsi="Courier New"/>
+          <w:sz w:val="16"/>
+        </w:rPr>
       </w:r>
     </w:p>
     <w:p>
-      <w:pPr>
-        <w:pStyle w:val="ListBullet"/>
-      </w:pPr>
-      <w:r/>
       <w:r>
         <w:rPr>
-          <w:b/>
+          <w:rFonts w:ascii="Courier New" w:hAnsi="Courier New"/>
+          <w:sz w:val="16"/>
         </w:rPr>
-        <w:t>Native SwiftUI app.</w:t>
-      </w:r>
-      <w:r>
-        <w:t xml:space="preserve"> The prototype logic (engine, config, copy) is the reference to port. The web-specific parts (service worker, Safari workarounds, localStorage) do not carry over.</w:t>
+        <w:t>1. Clone https://github.com/Rudhra6467/fitcoachai-prototype (branch main).</w:t>
       </w:r>
     </w:p>
     <w:p>
-      <w:pPr>
-        <w:pStyle w:val="ListBullet"/>
-      </w:pPr>
-      <w:r/>
       <w:r>
         <w:rPr>
-          <w:b/>
+          <w:rFonts w:ascii="Courier New" w:hAnsi="Courier New"/>
+          <w:sz w:val="16"/>
         </w:rPr>
-        <w:t>Real-iPhone testing.</w:t>
-      </w:r>
-      <w:r>
-        <w:t xml:space="preserve"> All automated testing so far is Playwright Chromium and WebKit; nothing is verified on a physical iPhone. Check voice, audio unlock, wake lock, Home Screen storage, the offline update flow and 3D performance.</w:t>
+        <w:t>2. Read, in order: docs/AUDIT-HANDOFF.md, docs/CORE-PRODUCT-LOGICS.docx (the locked product logic),</w:t>
       </w:r>
     </w:p>
     <w:p>
-      <w:pPr>
-        <w:pStyle w:val="ListBullet"/>
-      </w:pPr>
-      <w:r/>
       <w:r>
         <w:rPr>
-          <w:b/>
+          <w:rFonts w:ascii="Courier New" w:hAnsi="Courier New"/>
+          <w:sz w:val="16"/>
         </w:rPr>
-        <w:t>Expert review</w:t>
-      </w:r>
-      <w:r>
-        <w:t xml:space="preserve"> of placeholders and safety: coach / sports science, physio (including pelvic floor), clinical and legal.</w:t>
+        <w:t xml:space="preserve">   docs/ONBOARDING-SPEC.md, README.md, RESEARCH-FLAGS.md, UX-AUDIT.md.</w:t>
       </w:r>
     </w:p>
     <w:p>
-      <w:pPr>
-        <w:pStyle w:val="Heading1"/>
-      </w:pPr>
-      <w:r>
-        <w:t>5. What to look for — prioritised audit checklist</w:t>
+      <w:r>
+        <w:rPr>
+          <w:rFonts w:ascii="Courier New" w:hAnsi="Courier New"/>
+          <w:sz w:val="16"/>
+        </w:rPr>
+        <w:t>3. Read the code: index.html, js/config.js, js/engine.js, js/app.js, js/v05.js, js/v06.js, js/v07.js, sw.js, tests/.</w:t>
       </w:r>
     </w:p>
     <w:p>
-      <w:r/>
       <w:r>
         <w:rPr>
-          <w:b/>
+          <w:rFonts w:ascii="Courier New" w:hAnsi="Courier New"/>
+          <w:sz w:val="16"/>
         </w:rPr>
-        <w:t>P0 — Safety</w:t>
-      </w:r>
-      <w:r/>
+        <w:t xml:space="preserve">   Scripts load in that order, and later files override earlier functions.</w:t>
+      </w:r>
     </w:p>
     <w:p>
-      <w:pPr>
-        <w:pStyle w:val="ListNumber"/>
-      </w:pPr>
-      <w:r>
-        <w:t xml:space="preserve">The </w:t>
-      </w:r>
       <w:r>
         <w:rPr>
           <w:rFonts w:ascii="Courier New" w:hAnsi="Courier New"/>
+          <w:sz w:val="16"/>
         </w:rPr>
-        <w:t>SAFE</w:t>
-      </w:r>
-      <w:r>
-        <w:t xml:space="preserve"> statements in </w:t>
-      </w:r>
+        <w:t>4. Audit against the checklist in docs/AUDIT-HANDOFF.md section 5, in priority order (P0 first).</w:t>
+      </w:r>
+    </w:p>
+    <w:p>
       <w:r>
         <w:rPr>
           <w:rFonts w:ascii="Courier New" w:hAnsi="Courier New"/>
+          <w:sz w:val="16"/>
         </w:rPr>
-        <w:t>index.html</w:t>
-      </w:r>
-      <w:r>
-        <w:t xml:space="preserve"> are word for word with spec §0.1 and appear wherever the spec requires them (health-check stops, pain, during sessions, food).</w:t>
+        <w:t xml:space="preserve">   For each item give: PASS / ISSUE / UNSURE, the evidence with file:line references, and for an ISSUE</w:t>
       </w:r>
     </w:p>
     <w:p>
-      <w:pPr>
-        <w:pStyle w:val="ListNumber"/>
-      </w:pPr>
-      <w:r>
-        <w:t>Health-check logic: "not sure" counts as yes; stop screens for under 18, chest pain, fainting, pregnancy and the other spec stops (</w:t>
-      </w:r>
       <w:r>
         <w:rPr>
           <w:rFonts w:ascii="Courier New" w:hAnsi="Courier New"/>
+          <w:sz w:val="16"/>
         </w:rPr>
-        <w:t>tests/test.js</w:t>
-      </w:r>
-      <w:r>
-        <w:t xml:space="preserve"> covers four).</w:t>
+        <w:t xml:space="preserve">   the severity (critical/high/medium/low) and a concrete fix.</w:t>
       </w:r>
     </w:p>
     <w:p>
-      <w:pPr>
-        <w:pStyle w:val="ListNumber"/>
-      </w:pPr>
-      <w:r>
-        <w:t>A Stop button and spoken "stop" on every active exercise screen; sharp pain ends the session.</w:t>
+      <w:r>
+        <w:rPr>
+          <w:rFonts w:ascii="Courier New" w:hAnsi="Courier New"/>
+          <w:sz w:val="16"/>
+        </w:rPr>
+        <w:t>5. Check conformance with CORE-PRODUCT-LOGICS.docx and the APPROVED items in the onboarding spec: list any rule</w:t>
       </w:r>
     </w:p>
     <w:p>
-      <w:pPr>
-        <w:pStyle w:val="ListNumber"/>
-      </w:pPr>
-      <w:r>
-        <w:t>Pain paths (check-in, during the set, post-session, modification reason "pain", in-session skip with pain) all put the pattern on hold and never swap a painful movement for another.</w:t>
+      <w:r>
+        <w:rPr>
+          <w:rFonts w:ascii="Courier New" w:hAnsi="Courier New"/>
+          <w:sz w:val="16"/>
+        </w:rPr>
+        <w:t xml:space="preserve">   the code hard-codes that the doc does not settle (it should be a labelled placeholder), and any</w:t>
       </w:r>
     </w:p>
     <w:p>
-      <w:pPr>
-        <w:pStyle w:val="ListNumber"/>
-      </w:pPr>
-      <w:r>
-        <w:t>Postpartum and gentle-mode rules match the spec and the locked doc.</w:t>
+      <w:r>
+        <w:rPr>
+          <w:rFonts w:ascii="Courier New" w:hAnsi="Courier New"/>
+          <w:sz w:val="16"/>
+        </w:rPr>
+        <w:t xml:space="preserve">   place the code contradicts the doc.</w:t>
       </w:r>
     </w:p>
     <w:p>
-      <w:r/>
-      <w:r>
-        <w:rPr>
-          <w:b/>
-        </w:rPr>
-        <w:t>P0 — Engine invariants</w:t>
-      </w:r>
-      <w:r>
-        <w:t xml:space="preserve"> (</w:t>
-      </w:r>
       <w:r>
         <w:rPr>
           <w:rFonts w:ascii="Courier New" w:hAnsi="Courier New"/>
+          <w:sz w:val="16"/>
         </w:rPr>
-        <w:t>js/engine.js</w:t>
-      </w:r>
-      <w:r>
-        <w:t xml:space="preserve">, </w:t>
-      </w:r>
+        <w:t>6. Check that the safety statements (SAFE in index.html) match the spec's section 0.1 word for word.</w:t>
+      </w:r>
+    </w:p>
+    <w:p>
       <w:r>
         <w:rPr>
           <w:rFonts w:ascii="Courier New" w:hAnsi="Courier New"/>
+          <w:sz w:val="16"/>
         </w:rPr>
-        <w:t>tests/inv.js</w:t>
-      </w:r>
-      <w:r>
-        <w:t>)</w:t>
+        <w:t>7. Optionally run the tests (see AUDIT-HANDOFF section 3) and report the results.</w:t>
       </w:r>
     </w:p>
     <w:p>
-      <w:pPr>
-        <w:pStyle w:val="ListNumber"/>
-      </w:pPr>
-      <w:r>
-        <w:t>A level never changes by more than 1 per session; one bad day never lowers a level; the injury gate requires 3 pain-free sessions over at least 7 days, with no instant clearance; gentle-mode caps hold; short, lighter and swapped sessions never move a level; the engine is pure.</w:t>
+      <w:r>
+        <w:rPr>
+          <w:rFonts w:ascii="Courier New" w:hAnsi="Courier New"/>
+          <w:sz w:val="16"/>
+        </w:rPr>
+        <w:t>Rules: do not invent behaviour. Quote the code. If something can't be determined from the repo, say UNSURE</w:t>
       </w:r>
     </w:p>
     <w:p>
-      <w:r/>
-      <w:r>
-        <w:rPr>
-          <w:b/>
-        </w:rPr>
-        <w:t>P1 — Conformance with the locked doc</w:t>
-      </w:r>
-      <w:r/>
-    </w:p>
-    <w:p>
-      <w:pPr>
-        <w:pStyle w:val="ListNumber"/>
-      </w:pPr>
-      <w:r>
-        <w:t xml:space="preserve">Compare </w:t>
-      </w:r>
       <w:r>
         <w:rPr>
           <w:rFonts w:ascii="Courier New" w:hAnsi="Courier New"/>
-        </w:rPr>
-        <w:t>docs/CORE-PRODUCT-LOGICS.docx</w:t>
-      </w:r>
-      <w:r>
-        <w:t xml:space="preserve"> and the APPROVED items in the spec against what the code does. Anything not in the doc should be a labelled placeholder, not hard-coded.</w:t>
-      </w:r>
-    </w:p>
-    <w:p>
-      <w:r/>
-      <w:r>
-        <w:rPr>
-          <w:b/>
-        </w:rPr>
-        <w:t>P1 — Data integrity</w:t>
-      </w:r>
-      <w:r/>
-    </w:p>
-    <w:p>
-      <w:pPr>
-        <w:pStyle w:val="ListNumber"/>
-      </w:pPr>
-      <w:r/>
-      <w:r>
-        <w:rPr>
-          <w:rFonts w:ascii="Courier New" w:hAnsi="Courier New"/>
-        </w:rPr>
-        <w:t>migrateState</w:t>
-      </w:r>
-      <w:r>
-        <w:t xml:space="preserve"> handles schemas 1→4 without losing data; the event log is append-only; export and restore round-trip correctly; reload or resume mid-workout and mid-check-in works.</w:t>
-      </w:r>
-    </w:p>
-    <w:p>
-      <w:r/>
-      <w:r>
-        <w:rPr>
-          <w:b/>
-        </w:rPr>
-        <w:t>P1 — Privacy</w:t>
-      </w:r>
-      <w:r/>
-    </w:p>
-    <w:p>
-      <w:pPr>
-        <w:pStyle w:val="ListNumber"/>
-      </w:pPr>
-      <w:r>
-        <w:t>No network calls with user data. The only network use should be loading the app's own files (now same-origin). No analytics. The S2 privacy copy matches the behaviour.</w:t>
-      </w:r>
-    </w:p>
-    <w:p>
-      <w:r/>
-      <w:r>
-        <w:rPr>
-          <w:b/>
-        </w:rPr>
-        <w:t>P1 — Honest copy</w:t>
-      </w:r>
-      <w:r/>
-    </w:p>
-    <w:p>
-      <w:pPr>
-        <w:pStyle w:val="ListNumber"/>
-      </w:pPr>
-      <w:r>
-        <w:t>No outcome or timeline promises; plain language (grade 6–8, no jargon); "placeholder" labels visible; food guidance general only.</w:t>
-      </w:r>
-    </w:p>
-    <w:p>
-      <w:r/>
-      <w:r>
-        <w:rPr>
-          <w:b/>
-        </w:rPr>
-        <w:t>P2 — Licenses</w:t>
-      </w:r>
-      <w:r/>
-    </w:p>
-    <w:p>
-      <w:pPr>
-        <w:pStyle w:val="ListNumber"/>
-      </w:pPr>
-      <w:r>
-        <w:t>three.js (MIT), rich-body-highlighter (MIT) and coach-mannequin.glb (Quaternius, CC0, see README credits). Check that no other assets lack a license.</w:t>
-      </w:r>
-    </w:p>
-    <w:p>
-      <w:r/>
-      <w:r>
-        <w:rPr>
-          <w:b/>
-        </w:rPr>
-        <w:t>P2 — Accessibility</w:t>
-      </w:r>
-      <w:r/>
-    </w:p>
-    <w:p>
-      <w:pPr>
-        <w:pStyle w:val="ListNumber"/>
-      </w:pPr>
-      <w:r>
-        <w:t>Tap targets of at least 44 px, contrast, labels and roles on chip groups, screen-reader flow. Lighthouse accessibility is 100 at v0.7.0.</w:t>
-      </w:r>
-    </w:p>
-    <w:p>
-      <w:r/>
-      <w:r>
-        <w:rPr>
-          <w:b/>
-        </w:rPr>
-        <w:t>P2 — iOS Safari behaviour</w:t>
-      </w:r>
-      <w:r/>
-    </w:p>
-    <w:p>
-      <w:pPr>
-        <w:pStyle w:val="ListNumber"/>
-      </w:pPr>
-      <w:r>
-        <w:t>Safe areas, the floating toolbar, 16 px inputs, speech (synthesis and recognition availability), the service worker update bar, and Home Screen storage separate from Safari.</w:t>
-      </w:r>
-    </w:p>
-    <w:p>
-      <w:r/>
-      <w:r>
-        <w:rPr>
-          <w:b/>
-        </w:rPr>
-        <w:t>P2 — Test coverage gaps</w:t>
-      </w:r>
-      <w:r/>
-    </w:p>
-    <w:p>
-      <w:pPr>
-        <w:pStyle w:val="ListNumber"/>
-      </w:pPr>
-      <w:r>
-        <w:t>Known gaps: no real-device tests; speech recognition is faked in tests; not every spec stop path or region-to-pattern mapping is covered; 3D is checked only for render and offline; no fuzzing of imported backups beyond the basic invalid cases.</w:t>
-      </w:r>
-    </w:p>
-    <w:p>
-      <w:r/>
-      <w:r>
-        <w:rPr>
-          <w:b/>
-        </w:rPr>
-        <w:t>Known uncertainties (from the v0.6 and v0.7 reports)</w:t>
-      </w:r>
-      <w:r/>
-    </w:p>
-    <w:p>
-      <w:pPr>
-        <w:pStyle w:val="ListBullet"/>
-      </w:pPr>
-      <w:r>
-        <w:t>Lighter sessions do not count towards finishing calibration, so it can take slightly longer (R23).</w:t>
-      </w:r>
-    </w:p>
-    <w:p>
-      <w:pPr>
-        <w:pStyle w:val="ListBullet"/>
-      </w:pPr>
-      <w:r>
-        <w:t>Pain during a modification puts the movement on hold. That is consistent with the check-in pain rule, but it has had no clinical review.</w:t>
-      </w:r>
-    </w:p>
-    <w:p>
-      <w:pPr>
-        <w:pStyle w:val="ListBullet"/>
-      </w:pPr>
-      <w:r>
-        <w:t>Lighthouse performance is about 71 because the 3D coach dominates blocking time in headless Chrome. Real iPhone performance is unmeasured.</w:t>
-      </w:r>
-    </w:p>
-    <w:p>
-      <w:pPr>
-        <w:pStyle w:val="ListBullet"/>
-      </w:pPr>
-      <w:r>
-        <w:t>Every threshold in R1–R26 and X1–X8 is a placeholder without expert validation.</w:t>
-      </w:r>
-    </w:p>
-    <w:p>
-      <w:pPr>
-        <w:pStyle w:val="ListBullet"/>
-      </w:pPr>
-      <w:r>
-        <w:t>Override layering (</w:t>
-      </w:r>
-      <w:r>
-        <w:rPr>
-          <w:rFonts w:ascii="Courier New" w:hAnsi="Courier New"/>
-        </w:rPr>
-        <w:t>v05</w:t>
-      </w:r>
-      <w:r>
-        <w:t xml:space="preserve"> → </w:t>
-      </w:r>
-      <w:r>
-        <w:rPr>
-          <w:rFonts w:ascii="Courier New" w:hAnsi="Courier New"/>
-        </w:rPr>
-        <w:t>v07</w:t>
-      </w:r>
-      <w:r>
-        <w:t>) makes the call order non-obvious. It is a refactor candidate before porting.</w:t>
-      </w:r>
-    </w:p>
-    <w:p>
-      <w:pPr>
-        <w:pStyle w:val="Heading1"/>
-      </w:pPr>
-      <w:r>
-        <w:t>6. Prompt for Claude (paste as is)</w:t>
-      </w:r>
-    </w:p>
-    <w:p>
-      <w:r>
-        <w:rPr>
-          <w:rFonts w:ascii="Courier New" w:hAnsi="Courier New"/>
-          <w:sz w:val="18"/>
-        </w:rPr>
-        <w:t>You are auditing FitcoachAI, a draft fitness-coaching prototype (reference only, not medical advice).</w:t>
-      </w:r>
-    </w:p>
-    <w:p>
-      <w:r>
-        <w:rPr>
-          <w:rFonts w:ascii="Courier New" w:hAnsi="Courier New"/>
-          <w:sz w:val="18"/>
-        </w:rPr>
-      </w:r>
-    </w:p>
-    <w:p>
-      <w:r>
-        <w:rPr>
-          <w:rFonts w:ascii="Courier New" w:hAnsi="Courier New"/>
-          <w:sz w:val="18"/>
-        </w:rPr>
-        <w:t>1. Clone https://github.com/Rudhra6467/fitcoachai-prototype (branch main).</w:t>
-      </w:r>
-    </w:p>
-    <w:p>
-      <w:r>
-        <w:rPr>
-          <w:rFonts w:ascii="Courier New" w:hAnsi="Courier New"/>
-          <w:sz w:val="18"/>
-        </w:rPr>
-        <w:t>2. Read, in order: docs/AUDIT-HANDOFF.md, docs/CORE-PRODUCT-LOGICS.docx (the locked product logic),</w:t>
-      </w:r>
-    </w:p>
-    <w:p>
-      <w:r>
-        <w:rPr>
-          <w:rFonts w:ascii="Courier New" w:hAnsi="Courier New"/>
-          <w:sz w:val="18"/>
-        </w:rPr>
-        <w:t xml:space="preserve">   docs/ONBOARDING-SPEC.md, README.md, RESEARCH-FLAGS.md, UX-AUDIT.md.</w:t>
-      </w:r>
-    </w:p>
-    <w:p>
-      <w:r>
-        <w:rPr>
-          <w:rFonts w:ascii="Courier New" w:hAnsi="Courier New"/>
-          <w:sz w:val="18"/>
-        </w:rPr>
-        <w:t>3. Read the code: index.html, js/config.js, js/engine.js, js/app.js, js/v05.js, js/v06.js, js/v07.js, sw.js, tests/.</w:t>
-      </w:r>
-    </w:p>
-    <w:p>
-      <w:r>
-        <w:rPr>
-          <w:rFonts w:ascii="Courier New" w:hAnsi="Courier New"/>
-          <w:sz w:val="18"/>
-        </w:rPr>
-        <w:t xml:space="preserve">   Scripts load in that order, and later files override earlier functions.</w:t>
-      </w:r>
-    </w:p>
-    <w:p>
-      <w:r>
-        <w:rPr>
-          <w:rFonts w:ascii="Courier New" w:hAnsi="Courier New"/>
-          <w:sz w:val="18"/>
-        </w:rPr>
-        <w:t>4. Audit against the checklist in docs/AUDIT-HANDOFF.md section 5, in priority order (P0 first).</w:t>
-      </w:r>
-    </w:p>
-    <w:p>
-      <w:r>
-        <w:rPr>
-          <w:rFonts w:ascii="Courier New" w:hAnsi="Courier New"/>
-          <w:sz w:val="18"/>
-        </w:rPr>
-        <w:t xml:space="preserve">   For each item give: PASS / ISSUE / UNSURE, the evidence with file:line references, and for an ISSUE</w:t>
-      </w:r>
-    </w:p>
-    <w:p>
-      <w:r>
-        <w:rPr>
-          <w:rFonts w:ascii="Courier New" w:hAnsi="Courier New"/>
-          <w:sz w:val="18"/>
-        </w:rPr>
-        <w:t xml:space="preserve">   the severity (critical/high/medium/low) and a concrete fix.</w:t>
-      </w:r>
-    </w:p>
-    <w:p>
-      <w:r>
-        <w:rPr>
-          <w:rFonts w:ascii="Courier New" w:hAnsi="Courier New"/>
-          <w:sz w:val="18"/>
-        </w:rPr>
-        <w:t>5. Check conformance with CORE-PRODUCT-LOGICS.docx and the APPROVED items in the onboarding spec: list any rule</w:t>
-      </w:r>
-    </w:p>
-    <w:p>
-      <w:r>
-        <w:rPr>
-          <w:rFonts w:ascii="Courier New" w:hAnsi="Courier New"/>
-          <w:sz w:val="18"/>
-        </w:rPr>
-        <w:t xml:space="preserve">   the code hard-codes that the doc does not settle (it should be a labelled placeholder), and any</w:t>
-      </w:r>
-    </w:p>
-    <w:p>
-      <w:r>
-        <w:rPr>
-          <w:rFonts w:ascii="Courier New" w:hAnsi="Courier New"/>
-          <w:sz w:val="18"/>
-        </w:rPr>
-        <w:t xml:space="preserve">   place the code contradicts the doc.</w:t>
-      </w:r>
-    </w:p>
-    <w:p>
-      <w:r>
-        <w:rPr>
-          <w:rFonts w:ascii="Courier New" w:hAnsi="Courier New"/>
-          <w:sz w:val="18"/>
-        </w:rPr>
-        <w:t>6. Check that the safety statements (SAFE in index.html) match the spec's section 0.1 word for word.</w:t>
-      </w:r>
-    </w:p>
-    <w:p>
-      <w:r>
-        <w:rPr>
-          <w:rFonts w:ascii="Courier New" w:hAnsi="Courier New"/>
-          <w:sz w:val="18"/>
-        </w:rPr>
-        <w:t>7. Optionally run the tests (see AUDIT-HANDOFF section 3) and report the results.</w:t>
-      </w:r>
-    </w:p>
-    <w:p>
-      <w:r>
-        <w:rPr>
-          <w:rFonts w:ascii="Courier New" w:hAnsi="Courier New"/>
-          <w:sz w:val="18"/>
-        </w:rPr>
-        <w:t>Rules: do not invent behaviour. Quote the code. If something can't be determined from the repo, say UNSURE</w:t>
-      </w:r>
-    </w:p>
-    <w:p>
-      <w:r>
-        <w:rPr>
-          <w:rFonts w:ascii="Courier New" w:hAnsi="Courier New"/>
-          <w:sz w:val="18"/>
+          <w:sz w:val="16"/>
         </w:rPr>
         <w:t>and what would settle it. End with a top-10 list of the most important findings.</w:t>
       </w:r>

</xml_diff>

<commit_message>
v0.9.1: pre-native review — doc drift fixes, Health read types, Delete my data, bodyAreaHistory, Decision Round 2 (docs/PRE-NATIVE-REVIEW)
</commit_message>
<xml_diff>
--- a/docs/AUDIT-HANDOFF.docx
+++ b/docs/AUDIT-HANDOFF.docx
@@ -7,7 +7,7 @@
         <w:pStyle w:val="Heading1"/>
       </w:pPr>
       <w:r>
-        <w:t>FitcoachAI — Audit handoff (prototype v0.9.0)</w:t>
+        <w:t>FitcoachAI — Audit handoff (prototype v0.9.1)</w:t>
       </w:r>
     </w:p>
     <w:p>
@@ -667,6 +667,53 @@
           <w:p>
             <w:r/>
             <w:r>
+              <w:t>v0.7.0</w:t>
+            </w:r>
+          </w:p>
+        </w:tc>
+        <w:tc>
+          <w:tcPr>
+            <w:tcW w:type="dxa" w:w="2880"/>
+          </w:tcPr>
+          <w:p>
+            <w:r/>
+            <w:r>
+              <w:rPr>
+                <w:rFonts w:ascii="Courier New" w:hAnsi="Courier New"/>
+              </w:rPr>
+              <w:t>06a729f</w:t>
+            </w:r>
+            <w:r>
+              <w:t xml:space="preserve">, </w:t>
+            </w:r>
+            <w:r>
+              <w:rPr>
+                <w:rFonts w:ascii="Courier New" w:hAnsi="Courier New"/>
+              </w:rPr>
+              <w:t>cbfc3aa</w:t>
+            </w:r>
+          </w:p>
+        </w:tc>
+        <w:tc>
+          <w:tcPr>
+            <w:tcW w:type="dxa" w:w="2880"/>
+          </w:tcPr>
+          <w:p>
+            <w:r/>
+            <w:r>
+              <w:t>A "Hard" session or "Low" energy makes the next session lighter (same level, slightly lower target, can be declined). "Change something" (swap / skip / shorten with a reason, counter-offer first). "Why this workout" line. Root-cause fixes for two WebKit bugs; three.js vendored for offline use; lazy 3D; Lighthouse accessibility 95 → 100. Schema 4.</w:t>
+            </w:r>
+          </w:p>
+        </w:tc>
+      </w:tr>
+      <w:tr>
+        <w:tc>
+          <w:tcPr>
+            <w:tcW w:type="dxa" w:w="2880"/>
+          </w:tcPr>
+          <w:p>
+            <w:r/>
+            <w:r>
               <w:t>v0.7.1</w:t>
             </w:r>
           </w:p>
@@ -743,6 +790,62 @@
           <w:p>
             <w:r/>
             <w:r>
+              <w:t>v0.8.0</w:t>
+            </w:r>
+          </w:p>
+        </w:tc>
+        <w:tc>
+          <w:tcPr>
+            <w:tcW w:type="dxa" w:w="2880"/>
+          </w:tcPr>
+          <w:p>
+            <w:r/>
+            <w:r>
+              <w:rPr>
+                <w:rFonts w:ascii="Courier New" w:hAnsi="Courier New"/>
+              </w:rPr>
+              <w:t>01d9eb7</w:t>
+            </w:r>
+          </w:p>
+        </w:tc>
+        <w:tc>
+          <w:tcPr>
+            <w:tcW w:type="dxa" w:w="2880"/>
+          </w:tcPr>
+          <w:p>
+            <w:r/>
+            <w:r>
+              <w:t xml:space="preserve">Sit-to-stand 3D demo (CC0 Quaternius </w:t>
+            </w:r>
+            <w:r>
+              <w:rPr>
+                <w:rFonts w:ascii="Courier New" w:hAnsi="Courier New"/>
+              </w:rPr>
+              <w:t>Sitting_Exit</w:t>
+            </w:r>
+            <w:r>
+              <w:t>/</w:t>
+            </w:r>
+            <w:r>
+              <w:rPr>
+                <w:rFonts w:ascii="Courier New" w:hAnsi="Courier New"/>
+              </w:rPr>
+              <w:t>Sitting_Enter</w:t>
+            </w:r>
+            <w:r>
+              <w:t xml:space="preserve"> on a simple chair) on the intro and active screens of the 3 sit-to-stand steps. No other exercise has an honest CC0 clip, so they are listed as X9. Model 502 KB.</w:t>
+            </w:r>
+          </w:p>
+        </w:tc>
+      </w:tr>
+      <w:tr>
+        <w:tc>
+          <w:tcPr>
+            <w:tcW w:type="dxa" w:w="2880"/>
+          </w:tcPr>
+          <w:p>
+            <w:r/>
+            <w:r>
               <w:t>v0.9.0</w:t>
             </w:r>
           </w:p>
@@ -754,7 +857,10 @@
           <w:p>
             <w:r/>
             <w:r>
-              <w:t>(this release)</w:t>
+              <w:rPr>
+                <w:rFonts w:ascii="Courier New" w:hAnsi="Courier New"/>
+              </w:rPr>
+              <w:t>5301692</w:t>
             </w:r>
           </w:p>
         </w:tc>
@@ -805,7 +911,7 @@
           <w:p>
             <w:r/>
             <w:r>
-              <w:t>v0.8.0</w:t>
+              <w:t>v0.9.1</w:t>
             </w:r>
           </w:p>
         </w:tc>
@@ -816,7 +922,7 @@
           <w:p>
             <w:r/>
             <w:r>
-              <w:t>01d9eb7</w:t>
+              <w:t>(this release)</w:t>
             </w:r>
           </w:p>
         </w:tc>
@@ -827,72 +933,25 @@
           <w:p>
             <w:r/>
             <w:r>
-              <w:t xml:space="preserve">Sit-to-stand 3D demo (CC0 Quaternius </w:t>
+              <w:t>Pre-native review (</w:t>
             </w:r>
             <w:r>
               <w:rPr>
                 <w:rFonts w:ascii="Courier New" w:hAnsi="Courier New"/>
               </w:rPr>
-              <w:t>Sitting_Exit</w:t>
+              <w:t>docs/PRE-NATIVE-REVIEW.md</w:t>
             </w:r>
             <w:r>
-              <w:t>/</w:t>
+              <w:t xml:space="preserve">): doc drift fixed (retired 7-day floor, test lists, stale placeholder sections), Health screen shows only the approved read types, "Delete my data" button matches the privacy copy, removed/updated body areas kept in </w:t>
             </w:r>
             <w:r>
               <w:rPr>
                 <w:rFonts w:ascii="Courier New" w:hAnsi="Courier New"/>
               </w:rPr>
-              <w:t>Sitting_Enter</w:t>
+              <w:t>bodyAreaHistory</w:t>
             </w:r>
             <w:r>
-              <w:t xml:space="preserve"> on a simple chair) on the intro and active screens of the 3 sit-to-stand steps. No other exercise has an honest CC0 clip, so they are listed as X9. Model 502 KB.</w:t>
-            </w:r>
-          </w:p>
-        </w:tc>
-      </w:tr>
-      <w:tr>
-        <w:tc>
-          <w:tcPr>
-            <w:tcW w:type="dxa" w:w="2880"/>
-          </w:tcPr>
-          <w:p>
-            <w:r/>
-            <w:r>
-              <w:t>v0.7.0</w:t>
-            </w:r>
-          </w:p>
-        </w:tc>
-        <w:tc>
-          <w:tcPr>
-            <w:tcW w:type="dxa" w:w="2880"/>
-          </w:tcPr>
-          <w:p>
-            <w:r/>
-            <w:r>
-              <w:rPr>
-                <w:rFonts w:ascii="Courier New" w:hAnsi="Courier New"/>
-              </w:rPr>
-              <w:t>06a729f</w:t>
-            </w:r>
-            <w:r>
-              <w:t xml:space="preserve">, </w:t>
-            </w:r>
-            <w:r>
-              <w:rPr>
-                <w:rFonts w:ascii="Courier New" w:hAnsi="Courier New"/>
-              </w:rPr>
-              <w:t>cbfc3aa</w:t>
-            </w:r>
-          </w:p>
-        </w:tc>
-        <w:tc>
-          <w:tcPr>
-            <w:tcW w:type="dxa" w:w="2880"/>
-          </w:tcPr>
-          <w:p>
-            <w:r/>
-            <w:r>
-              <w:t>A "Hard" session or "Low" energy makes the next session lighter (same level, slightly lower target, can be declined). "Change something" (swap / skip / shorten with a reason, counter-offer first). "Why this workout" line. Root-cause fixes for two WebKit bugs; three.js vendored for offline use; lazy 3D; Lighthouse accessibility 95 → 100. Schema 4.</w:t>
+              <w:t>. Decision Round 2 opened for the product conflicts with the locked doc.</w:t>
             </w:r>
           </w:p>
         </w:tc>
@@ -1160,7 +1219,7 @@
         <w:rPr>
           <w:rFonts w:ascii="Courier New" w:hAnsi="Courier New"/>
         </w:rPr>
-        <w:t>fcai-v0.9.0</w:t>
+        <w:t>fcai-v0.9.1</w:t>
       </w:r>
       <w:r>
         <w:t>) that precaches the app, three.js and the 3D model.</w:t>
@@ -2206,7 +2265,16 @@
         <w:t>v090.js</w:t>
       </w:r>
       <w:r>
-        <w:t xml:space="preserve">, </w:t>
+        <w:t xml:space="preserve"> (Decision Round 1), </w:t>
+      </w:r>
+      <w:r>
+        <w:rPr>
+          <w:rFonts w:ascii="Courier New" w:hAnsi="Courier New"/>
+        </w:rPr>
+        <w:t>v091.js</w:t>
+      </w:r>
+      <w:r>
+        <w:t xml:space="preserve"> (pre-native fixes), </w:t>
       </w:r>
       <w:r>
         <w:rPr>
@@ -2233,7 +2301,7 @@
         <w:t>v072.js</w:t>
       </w:r>
       <w:r>
-        <w:t xml:space="preserve"> (3D coach reduced motion / fit / fallback, caption bar vs Stop). At v0.7.2 all 8 suites passed on Chromium and WebKit. At v0.7.0 all passed on Chromium and WebKit: v07 28, v06 29, v05 32, ui 32, test 28, inv 18, audit 34 taps / 15 screens.</w:t>
+        <w:t xml:space="preserve"> (3D coach reduced motion / fit / fallback, caption bar vs Stop). At v0.9.1 all 11 suites pass on Chromium and WebKit (see README for the runner).</w:t>
       </w:r>
     </w:p>
     <w:p>
@@ -2307,7 +2375,7 @@
         <w:pStyle w:val="Heading3"/>
       </w:pPr>
       <w:r>
-        <w:t>Open placeholders (`RESEARCH-FLAGS.md`; config `FC_CONFIG.RESEARCH_NEEDED`)</w:t>
+        <w:t>Still open after Decision Round 1 (`RESEARCH-FLAGS.md`, `docs/DECISION-ROUND-1.md`)</w:t>
       </w:r>
     </w:p>
     <w:p>
@@ -2318,10 +2386,10 @@
         <w:rPr>
           <w:b/>
         </w:rPr>
-        <w:t>Dose and progression:</w:t>
-      </w:r>
-      <w:r>
-        <w:t xml:space="preserve"> R1 rep/hold/time ranges and sets; R2 ladder levels (4); R3 clean sessions before step-up, rep increment; R4 bad-session thresholds; R5 anti-thrash gap; R6 plateau responses; R7 gentle-mode cap and spacing; R12 rest between sets.</w:t>
+        <w:t>Deferred (9):</w:t>
+      </w:r>
+      <w:r>
+        <w:t xml:space="preserve"> X6 injury-map physio review; X9 demo animation budget; R24 experience → tone; OQ-1a pelvic-floor physio review (interim C-section line shipped); OQ-5 legal/clinical wording review; OQ-15 regulatory review; OQ-11 backups (native build); OQ-12 first name (pilot); OQ-16 screen count (user testing).</w:t>
       </w:r>
     </w:p>
     <w:p>
@@ -2332,10 +2400,10 @@
         <w:rPr>
           <w:b/>
         </w:rPr>
-        <w:t>Day-to-day:</w:t>
-      </w:r>
-      <w:r>
-        <w:t xml:space="preserve"> R10 check-in triage; R11 check-in pain effects; R13 short-sleep threshold; R14 default nudge time; R15 short-session offer; R16 weekly goal and streak; R17 one-tap start meaning; R18 onboarding defaults.</w:t>
+        <w:t>Approved but needing review before launch:</w:t>
+      </w:r>
+      <w:r>
+        <w:t xml:space="preserve"> R7, OQ-17 (physio); R11, X2 (clinical); X8 (design); R17 (pilot comparison); OQ-13 (pilot measurement).</w:t>
       </w:r>
     </w:p>
     <w:p>
@@ -2346,10 +2414,27 @@
         <w:rPr>
           <w:b/>
         </w:rPr>
-        <w:t>Calibration and scoring:</w:t>
-      </w:r>
-      <w:r>
-        <w:t xml:space="preserve"> R19 when calibration ends (R8 superseded); R20 beginner starting steps; R21 Performance Score formula (R9 superseded for display); R22 "finished fast" cue.</w:t>
+        <w:t>Decision Round 2</w:t>
+      </w:r>
+      <w:r>
+        <w:t xml:space="preserve"> (</w:t>
+      </w:r>
+      <w:r>
+        <w:rPr>
+          <w:rFonts w:ascii="Courier New" w:hAnsi="Courier New"/>
+        </w:rPr>
+        <w:t>docs/PRE-NATIVE-REVIEW.md</w:t>
+      </w:r>
+      <w:r>
+        <w:t>): conflicts between the locked CORE-PRODUCT-LOGICS doc and the prototype, to decide before the native build.</w:t>
+      </w:r>
+    </w:p>
+    <w:p>
+      <w:pPr>
+        <w:pStyle w:val="Heading3"/>
+      </w:pPr>
+      <w:r>
+        <w:t>Next steps</w:t>
       </w:r>
     </w:p>
     <w:p>
@@ -2360,10 +2445,10 @@
         <w:rPr>
           <w:b/>
         </w:rPr>
-        <w:t>v0.7:</w:t>
-      </w:r>
-      <w:r>
-        <w:t xml:space="preserve"> R23 post-session effects including the lighter next session; R24 experience → tone only; R25 modification path; R26 days-per-week suggestion.</w:t>
+        <w:t>Native SwiftUI app.</w:t>
+      </w:r>
+      <w:r>
+        <w:t xml:space="preserve"> The prototype logic (engine, config, copy) is the reference to port. The web-specific parts (service worker, Safari workarounds, localStorage) do not carry over.</w:t>
       </w:r>
     </w:p>
     <w:p>
@@ -2374,19 +2459,10 @@
         <w:rPr>
           <w:b/>
         </w:rPr>
-        <w:t>v0.8.0:</w:t>
-      </w:r>
-      <w:r>
-        <w:t xml:space="preserve"> X9 demo animations needed (every exercise except sit-to-stand). Decisions for all open items are in </w:t>
-      </w:r>
-      <w:r>
-        <w:rPr>
-          <w:rFonts w:ascii="Courier New" w:hAnsi="Courier New"/>
-        </w:rPr>
-        <w:t>docs/DECISION-ROUND-1.md</w:t>
-      </w:r>
-      <w:r>
-        <w:t>.</w:t>
+        <w:t>Real-iPhone testing.</w:t>
+      </w:r>
+      <w:r>
+        <w:t xml:space="preserve"> All automated testing so far is Playwright Chromium and WebKit; nothing is verified on a physical iPhone. Check voice, audio unlock, wake lock, Home Screen storage, the offline update flow and 3D performance.</w:t>
       </w:r>
     </w:p>
     <w:p>
@@ -2397,10 +2473,290 @@
         <w:rPr>
           <w:b/>
         </w:rPr>
-        <w:t>v0.9.0:</w:t>
-      </w:r>
-      <w:r>
-        <w:t xml:space="preserve"> Decision Round 1 approved 27 Oct 2026. Still open (deferred): X6, X9, R24, OQ-1a, OQ-5, OQ-15, OQ-11, OQ-12, OQ-16. Pre-launch reviews still required for R7, OQ-17, R11, X2, X8, R17, OQ-13.</w:t>
+        <w:t>Expert review</w:t>
+      </w:r>
+      <w:r>
+        <w:t xml:space="preserve"> of placeholders and safety: coach / sports science, physio (including pelvic floor), clinical and legal.</w:t>
+      </w:r>
+    </w:p>
+    <w:p>
+      <w:pPr>
+        <w:pStyle w:val="Heading2"/>
+      </w:pPr>
+      <w:r>
+        <w:t>5. What to look for — prioritised audit checklist</w:t>
+      </w:r>
+    </w:p>
+    <w:p>
+      <w:r>
+        <w:rPr>
+          <w:b/>
+        </w:rPr>
+        <w:t>P0 — Safety</w:t>
+      </w:r>
+    </w:p>
+    <w:p>
+      <w:pPr>
+        <w:pStyle w:val="ListNumber"/>
+      </w:pPr>
+      <w:r>
+        <w:t xml:space="preserve">The </w:t>
+      </w:r>
+      <w:r>
+        <w:rPr>
+          <w:rFonts w:ascii="Courier New" w:hAnsi="Courier New"/>
+        </w:rPr>
+        <w:t>SAFE</w:t>
+      </w:r>
+      <w:r>
+        <w:t xml:space="preserve"> statements in </w:t>
+      </w:r>
+      <w:r>
+        <w:rPr>
+          <w:rFonts w:ascii="Courier New" w:hAnsi="Courier New"/>
+        </w:rPr>
+        <w:t>index.html</w:t>
+      </w:r>
+      <w:r>
+        <w:t xml:space="preserve"> are word for word with spec §0.1 and appear wherever the spec requires them (health-check stops, pain, during sessions, food).</w:t>
+      </w:r>
+    </w:p>
+    <w:p>
+      <w:pPr>
+        <w:pStyle w:val="ListNumber"/>
+      </w:pPr>
+      <w:r>
+        <w:t>Health-check logic: "not sure" counts as yes; stop screens for under 18, chest pain, fainting, pregnancy and the other spec stops (</w:t>
+      </w:r>
+      <w:r>
+        <w:rPr>
+          <w:rFonts w:ascii="Courier New" w:hAnsi="Courier New"/>
+        </w:rPr>
+        <w:t>tests/test.js</w:t>
+      </w:r>
+      <w:r>
+        <w:t xml:space="preserve"> covers four).</w:t>
+      </w:r>
+    </w:p>
+    <w:p>
+      <w:pPr>
+        <w:pStyle w:val="ListNumber"/>
+      </w:pPr>
+      <w:r>
+        <w:t>A Stop button and spoken "stop" on every active exercise screen; sharp pain ends the session.</w:t>
+      </w:r>
+    </w:p>
+    <w:p>
+      <w:pPr>
+        <w:pStyle w:val="ListNumber"/>
+      </w:pPr>
+      <w:r>
+        <w:t>Pain paths (check-in, during the set, post-session, modification reason "pain", in-session skip with pain) all put the pattern on hold and never swap a painful movement for another.</w:t>
+      </w:r>
+    </w:p>
+    <w:p>
+      <w:pPr>
+        <w:pStyle w:val="ListNumber"/>
+      </w:pPr>
+      <w:r>
+        <w:t>Postpartum and gentle-mode rules match the spec and the locked doc.</w:t>
+      </w:r>
+    </w:p>
+    <w:p>
+      <w:r>
+        <w:rPr>
+          <w:b/>
+        </w:rPr>
+        <w:t>P0 — Engine invariants</w:t>
+      </w:r>
+      <w:r>
+        <w:t xml:space="preserve"> (</w:t>
+      </w:r>
+      <w:r>
+        <w:rPr>
+          <w:rFonts w:ascii="Courier New" w:hAnsi="Courier New"/>
+        </w:rPr>
+        <w:t>js/engine.js</w:t>
+      </w:r>
+      <w:r>
+        <w:t xml:space="preserve">, </w:t>
+      </w:r>
+      <w:r>
+        <w:rPr>
+          <w:rFonts w:ascii="Courier New" w:hAnsi="Courier New"/>
+        </w:rPr>
+        <w:t>tests/inv.js</w:t>
+      </w:r>
+      <w:r>
+        <w:t>)</w:t>
+      </w:r>
+    </w:p>
+    <w:p>
+      <w:pPr>
+        <w:pStyle w:val="ListNumber"/>
+      </w:pPr>
+      <w:r>
+        <w:t>A level never changes by more than 1 per session; one bad day never lowers a level; the injury gate requires 3 pain-free sessions over at least 7 days, with no instant clearance; gentle-mode caps hold; short, lighter and swapped sessions never move a level; the engine is pure.</w:t>
+      </w:r>
+    </w:p>
+    <w:p>
+      <w:r>
+        <w:rPr>
+          <w:b/>
+        </w:rPr>
+        <w:t>P1 — Conformance with the locked doc</w:t>
+      </w:r>
+    </w:p>
+    <w:p>
+      <w:pPr>
+        <w:pStyle w:val="ListNumber"/>
+      </w:pPr>
+      <w:r>
+        <w:t xml:space="preserve">Compare </w:t>
+      </w:r>
+      <w:r>
+        <w:rPr>
+          <w:rFonts w:ascii="Courier New" w:hAnsi="Courier New"/>
+        </w:rPr>
+        <w:t>docs/CORE-PRODUCT-LOGICS.docx</w:t>
+      </w:r>
+      <w:r>
+        <w:t xml:space="preserve"> and the APPROVED items against what the code does. Known conflicts are listed in </w:t>
+      </w:r>
+      <w:r>
+        <w:rPr>
+          <w:rFonts w:ascii="Courier New" w:hAnsi="Courier New"/>
+        </w:rPr>
+        <w:t>docs/PRE-NATIVE-REVIEW.md</w:t>
+      </w:r>
+      <w:r>
+        <w:t xml:space="preserve"> (Decision Round 2).</w:t>
+      </w:r>
+    </w:p>
+    <w:p>
+      <w:r>
+        <w:rPr>
+          <w:b/>
+        </w:rPr>
+        <w:t>P1 — Data integrity</w:t>
+      </w:r>
+    </w:p>
+    <w:p>
+      <w:pPr>
+        <w:pStyle w:val="ListNumber"/>
+      </w:pPr>
+      <w:r>
+        <w:rPr>
+          <w:rFonts w:ascii="Courier New" w:hAnsi="Courier New"/>
+        </w:rPr>
+        <w:t>migrateState</w:t>
+      </w:r>
+      <w:r>
+        <w:t xml:space="preserve"> handles schemas 1→4 without losing data; the event log is append-only; export and restore round-trip correctly; reload or resume mid-workout and mid-check-in works.</w:t>
+      </w:r>
+    </w:p>
+    <w:p>
+      <w:r>
+        <w:rPr>
+          <w:b/>
+        </w:rPr>
+        <w:t>P1 — Privacy</w:t>
+      </w:r>
+    </w:p>
+    <w:p>
+      <w:pPr>
+        <w:pStyle w:val="ListNumber"/>
+      </w:pPr>
+      <w:r>
+        <w:t>No network calls with user data. The only network use should be loading the app's own files (now same-origin). No analytics. The S2 privacy copy matches the behaviour.</w:t>
+      </w:r>
+    </w:p>
+    <w:p>
+      <w:r>
+        <w:rPr>
+          <w:b/>
+        </w:rPr>
+        <w:t>P1 — Honest copy</w:t>
+      </w:r>
+    </w:p>
+    <w:p>
+      <w:pPr>
+        <w:pStyle w:val="ListNumber"/>
+      </w:pPr>
+      <w:r>
+        <w:t>No outcome or timeline promises; plain language (grade 6–8, no jargon); no stale "placeholder" labels for approved values; food guidance general only.</w:t>
+      </w:r>
+    </w:p>
+    <w:p>
+      <w:r>
+        <w:rPr>
+          <w:b/>
+        </w:rPr>
+        <w:t>P2 — Licenses</w:t>
+      </w:r>
+    </w:p>
+    <w:p>
+      <w:pPr>
+        <w:pStyle w:val="ListNumber"/>
+      </w:pPr>
+      <w:r>
+        <w:t>three.js (MIT), rich-body-highlighter (MIT) and coach-mannequin.glb (Quaternius, CC0, see README credits). Check that no other assets lack a license.</w:t>
+      </w:r>
+    </w:p>
+    <w:p>
+      <w:r>
+        <w:rPr>
+          <w:b/>
+        </w:rPr>
+        <w:t>P2 — Accessibility</w:t>
+      </w:r>
+    </w:p>
+    <w:p>
+      <w:pPr>
+        <w:pStyle w:val="ListNumber"/>
+      </w:pPr>
+      <w:r>
+        <w:t>Tap targets of at least 44 px, contrast, labels and roles on chip groups, screen-reader flow. Lighthouse accessibility is 100 at v0.7.0.</w:t>
+      </w:r>
+    </w:p>
+    <w:p>
+      <w:r>
+        <w:rPr>
+          <w:b/>
+        </w:rPr>
+        <w:t>P2 — iOS Safari behaviour</w:t>
+      </w:r>
+    </w:p>
+    <w:p>
+      <w:pPr>
+        <w:pStyle w:val="ListNumber"/>
+      </w:pPr>
+      <w:r>
+        <w:t>Safe areas, the floating toolbar, 16 px inputs, speech (synthesis and recognition availability), the service worker update bar, and Home Screen storage separate from Safari.</w:t>
+      </w:r>
+    </w:p>
+    <w:p>
+      <w:r>
+        <w:rPr>
+          <w:b/>
+        </w:rPr>
+        <w:t>P2 — Test coverage gaps</w:t>
+      </w:r>
+    </w:p>
+    <w:p>
+      <w:pPr>
+        <w:pStyle w:val="ListNumber"/>
+      </w:pPr>
+      <w:r>
+        <w:t>Known gaps: no real-device tests; speech recognition is faked in tests; not every spec stop path or region-to-pattern mapping is covered; 3D is checked only for render and offline; no fuzzing of imported backups beyond the basic invalid cases.</w:t>
+      </w:r>
+    </w:p>
+    <w:p>
+      <w:r>
+        <w:rPr>
+          <w:b/>
+        </w:rPr>
+        <w:t>Known uncertainties (from the v0.6 and v0.7 reports)</w:t>
       </w:r>
     </w:p>
     <w:p>
@@ -2408,13 +2764,7 @@
         <w:pStyle w:val="ListBullet"/>
       </w:pPr>
       <w:r>
-        <w:rPr>
-          <w:b/>
-        </w:rPr>
-        <w:t>v0.7.1:</w:t>
-      </w:r>
-      <w:r>
-        <w:t xml:space="preserve"> X8 look of the 3D coach (placeholder art). In v0.7.2 it is tinted to the app palette at runtime only; the CC0 file is unchanged.</w:t>
+        <w:t>Lighter sessions do not count towards finishing calibration, so it can take slightly longer (R23).</w:t>
       </w:r>
     </w:p>
     <w:p>
@@ -2422,34 +2772,7 @@
         <w:pStyle w:val="ListBullet"/>
       </w:pPr>
       <w:r>
-        <w:rPr>
-          <w:b/>
-        </w:rPr>
-        <w:t>Code heuristics:</w:t>
-      </w:r>
-      <w:r>
-        <w:t xml:space="preserve"> X1 evidence tiers; X2 tolerance labels; X3 rest-day touchpoint; X4 measure-chip ranges; X5 step-up verification; X6 injury flag from onboarding; X7 reminder demo.</w:t>
-      </w:r>
-    </w:p>
-    <w:p>
-      <w:pPr>
-        <w:pStyle w:val="Heading3"/>
-      </w:pPr>
-      <w:r>
-        <w:t>11 open questions in the onboarding spec (§7.1)</w:t>
-      </w:r>
-    </w:p>
-    <w:p>
-      <w:r>
-        <w:t>OQ-1a pelvic-floor physio review of the postpartum rules; OQ-5 legal and clinical sign-off and localisation of the safety wording; OQ-6b whether people 70+ default to gentle mode; OQ-9 holidays (locale vs Calendar access); OQ-11 backups/export; OQ-12 optional first name for voice; OQ-13 voice reliability in noisy homes; OQ-15 regulatory positioning (general wellness) and App Store rules; OQ-16 screen count; OQ-17 gentle-mode details; OQ-18 Apple Health read types.</w:t>
-      </w:r>
-    </w:p>
-    <w:p>
-      <w:pPr>
-        <w:pStyle w:val="Heading3"/>
-      </w:pPr>
-      <w:r>
-        <w:t>Next steps</w:t>
+        <w:t>Pain during a modification puts the movement on hold. That is consistent with the check-in pain rule, but it has had no clinical review.</w:t>
       </w:r>
     </w:p>
     <w:p>
@@ -2457,13 +2780,7 @@
         <w:pStyle w:val="ListBullet"/>
       </w:pPr>
       <w:r>
-        <w:rPr>
-          <w:b/>
-        </w:rPr>
-        <w:t>Native SwiftUI app.</w:t>
-      </w:r>
-      <w:r>
-        <w:t xml:space="preserve"> The prototype logic (engine, config, copy) is the reference to port. The web-specific parts (service worker, Safari workarounds, localStorage) do not carry over.</w:t>
+        <w:t>Lighthouse performance is about 71 because the 3D coach dominates blocking time in headless Chrome. Real iPhone performance is unmeasured.</w:t>
       </w:r>
     </w:p>
     <w:p>
@@ -2471,330 +2788,7 @@
         <w:pStyle w:val="ListBullet"/>
       </w:pPr>
       <w:r>
-        <w:rPr>
-          <w:b/>
-        </w:rPr>
-        <w:t>Real-iPhone testing.</w:t>
-      </w:r>
-      <w:r>
-        <w:t xml:space="preserve"> All automated testing so far is Playwright Chromium and WebKit; nothing is verified on a physical iPhone. Check voice, audio unlock, wake lock, Home Screen storage, the offline update flow and 3D performance.</w:t>
-      </w:r>
-    </w:p>
-    <w:p>
-      <w:pPr>
-        <w:pStyle w:val="ListBullet"/>
-      </w:pPr>
-      <w:r>
-        <w:rPr>
-          <w:b/>
-        </w:rPr>
-        <w:t>Expert review</w:t>
-      </w:r>
-      <w:r>
-        <w:t xml:space="preserve"> of placeholders and safety: coach / sports science, physio (including pelvic floor), clinical and legal.</w:t>
-      </w:r>
-    </w:p>
-    <w:p>
-      <w:pPr>
-        <w:pStyle w:val="Heading2"/>
-      </w:pPr>
-      <w:r>
-        <w:t>5. What to look for — prioritised audit checklist</w:t>
-      </w:r>
-    </w:p>
-    <w:p>
-      <w:r>
-        <w:rPr>
-          <w:b/>
-        </w:rPr>
-        <w:t>P0 — Safety</w:t>
-      </w:r>
-    </w:p>
-    <w:p>
-      <w:pPr>
-        <w:pStyle w:val="ListNumber"/>
-      </w:pPr>
-      <w:r>
-        <w:t xml:space="preserve">The </w:t>
-      </w:r>
-      <w:r>
-        <w:rPr>
-          <w:rFonts w:ascii="Courier New" w:hAnsi="Courier New"/>
-        </w:rPr>
-        <w:t>SAFE</w:t>
-      </w:r>
-      <w:r>
-        <w:t xml:space="preserve"> statements in </w:t>
-      </w:r>
-      <w:r>
-        <w:rPr>
-          <w:rFonts w:ascii="Courier New" w:hAnsi="Courier New"/>
-        </w:rPr>
-        <w:t>index.html</w:t>
-      </w:r>
-      <w:r>
-        <w:t xml:space="preserve"> are word for word with spec §0.1 and appear wherever the spec requires them (health-check stops, pain, during sessions, food).</w:t>
-      </w:r>
-    </w:p>
-    <w:p>
-      <w:pPr>
-        <w:pStyle w:val="ListNumber"/>
-      </w:pPr>
-      <w:r>
-        <w:t>Health-check logic: "not sure" counts as yes; stop screens for under 18, chest pain, fainting, pregnancy and the other spec stops (</w:t>
-      </w:r>
-      <w:r>
-        <w:rPr>
-          <w:rFonts w:ascii="Courier New" w:hAnsi="Courier New"/>
-        </w:rPr>
-        <w:t>tests/test.js</w:t>
-      </w:r>
-      <w:r>
-        <w:t xml:space="preserve"> covers four).</w:t>
-      </w:r>
-    </w:p>
-    <w:p>
-      <w:pPr>
-        <w:pStyle w:val="ListNumber"/>
-      </w:pPr>
-      <w:r>
-        <w:t>A Stop button and spoken "stop" on every active exercise screen; sharp pain ends the session.</w:t>
-      </w:r>
-    </w:p>
-    <w:p>
-      <w:pPr>
-        <w:pStyle w:val="ListNumber"/>
-      </w:pPr>
-      <w:r>
-        <w:t>Pain paths (check-in, during the set, post-session, modification reason "pain", in-session skip with pain) all put the pattern on hold and never swap a painful movement for another.</w:t>
-      </w:r>
-    </w:p>
-    <w:p>
-      <w:pPr>
-        <w:pStyle w:val="ListNumber"/>
-      </w:pPr>
-      <w:r>
-        <w:t>Postpartum and gentle-mode rules match the spec and the locked doc.</w:t>
-      </w:r>
-    </w:p>
-    <w:p>
-      <w:r>
-        <w:rPr>
-          <w:b/>
-        </w:rPr>
-        <w:t>P0 — Engine invariants</w:t>
-      </w:r>
-      <w:r>
-        <w:t xml:space="preserve"> (</w:t>
-      </w:r>
-      <w:r>
-        <w:rPr>
-          <w:rFonts w:ascii="Courier New" w:hAnsi="Courier New"/>
-        </w:rPr>
-        <w:t>js/engine.js</w:t>
-      </w:r>
-      <w:r>
-        <w:t xml:space="preserve">, </w:t>
-      </w:r>
-      <w:r>
-        <w:rPr>
-          <w:rFonts w:ascii="Courier New" w:hAnsi="Courier New"/>
-        </w:rPr>
-        <w:t>tests/inv.js</w:t>
-      </w:r>
-      <w:r>
-        <w:t>)</w:t>
-      </w:r>
-    </w:p>
-    <w:p>
-      <w:pPr>
-        <w:pStyle w:val="ListNumber"/>
-      </w:pPr>
-      <w:r>
-        <w:t>A level never changes by more than 1 per session; one bad day never lowers a level; the injury gate requires 3 pain-free sessions over at least 7 days, with no instant clearance; gentle-mode caps hold; short, lighter and swapped sessions never move a level; the engine is pure.</w:t>
-      </w:r>
-    </w:p>
-    <w:p>
-      <w:r>
-        <w:rPr>
-          <w:b/>
-        </w:rPr>
-        <w:t>P1 — Conformance with the locked doc</w:t>
-      </w:r>
-    </w:p>
-    <w:p>
-      <w:pPr>
-        <w:pStyle w:val="ListNumber"/>
-      </w:pPr>
-      <w:r>
-        <w:t xml:space="preserve">Compare </w:t>
-      </w:r>
-      <w:r>
-        <w:rPr>
-          <w:rFonts w:ascii="Courier New" w:hAnsi="Courier New"/>
-        </w:rPr>
-        <w:t>docs/CORE-PRODUCT-LOGICS.docx</w:t>
-      </w:r>
-      <w:r>
-        <w:t xml:space="preserve"> and the APPROVED items in the spec against what the code does. Anything not in the doc should be a labelled placeholder, not hard-coded.</w:t>
-      </w:r>
-    </w:p>
-    <w:p>
-      <w:r>
-        <w:rPr>
-          <w:b/>
-        </w:rPr>
-        <w:t>P1 — Data integrity</w:t>
-      </w:r>
-    </w:p>
-    <w:p>
-      <w:pPr>
-        <w:pStyle w:val="ListNumber"/>
-      </w:pPr>
-      <w:r>
-        <w:rPr>
-          <w:rFonts w:ascii="Courier New" w:hAnsi="Courier New"/>
-        </w:rPr>
-        <w:t>migrateState</w:t>
-      </w:r>
-      <w:r>
-        <w:t xml:space="preserve"> handles schemas 1→4 without losing data; the event log is append-only; export and restore round-trip correctly; reload or resume mid-workout and mid-check-in works.</w:t>
-      </w:r>
-    </w:p>
-    <w:p>
-      <w:r>
-        <w:rPr>
-          <w:b/>
-        </w:rPr>
-        <w:t>P1 — Privacy</w:t>
-      </w:r>
-    </w:p>
-    <w:p>
-      <w:pPr>
-        <w:pStyle w:val="ListNumber"/>
-      </w:pPr>
-      <w:r>
-        <w:t>No network calls with user data. The only network use should be loading the app's own files (now same-origin). No analytics. The S2 privacy copy matches the behaviour.</w:t>
-      </w:r>
-    </w:p>
-    <w:p>
-      <w:r>
-        <w:rPr>
-          <w:b/>
-        </w:rPr>
-        <w:t>P1 — Honest copy</w:t>
-      </w:r>
-    </w:p>
-    <w:p>
-      <w:pPr>
-        <w:pStyle w:val="ListNumber"/>
-      </w:pPr>
-      <w:r>
-        <w:t>No outcome or timeline promises; plain language (grade 6–8, no jargon); "placeholder" labels visible; food guidance general only.</w:t>
-      </w:r>
-    </w:p>
-    <w:p>
-      <w:r>
-        <w:rPr>
-          <w:b/>
-        </w:rPr>
-        <w:t>P2 — Licenses</w:t>
-      </w:r>
-    </w:p>
-    <w:p>
-      <w:pPr>
-        <w:pStyle w:val="ListNumber"/>
-      </w:pPr>
-      <w:r>
-        <w:t>three.js (MIT), rich-body-highlighter (MIT) and coach-mannequin.glb (Quaternius, CC0, see README credits). Check that no other assets lack a license.</w:t>
-      </w:r>
-    </w:p>
-    <w:p>
-      <w:r>
-        <w:rPr>
-          <w:b/>
-        </w:rPr>
-        <w:t>P2 — Accessibility</w:t>
-      </w:r>
-    </w:p>
-    <w:p>
-      <w:pPr>
-        <w:pStyle w:val="ListNumber"/>
-      </w:pPr>
-      <w:r>
-        <w:t>Tap targets of at least 44 px, contrast, labels and roles on chip groups, screen-reader flow. Lighthouse accessibility is 100 at v0.7.0.</w:t>
-      </w:r>
-    </w:p>
-    <w:p>
-      <w:r>
-        <w:rPr>
-          <w:b/>
-        </w:rPr>
-        <w:t>P2 — iOS Safari behaviour</w:t>
-      </w:r>
-    </w:p>
-    <w:p>
-      <w:pPr>
-        <w:pStyle w:val="ListNumber"/>
-      </w:pPr>
-      <w:r>
-        <w:t>Safe areas, the floating toolbar, 16 px inputs, speech (synthesis and recognition availability), the service worker update bar, and Home Screen storage separate from Safari.</w:t>
-      </w:r>
-    </w:p>
-    <w:p>
-      <w:r>
-        <w:rPr>
-          <w:b/>
-        </w:rPr>
-        <w:t>P2 — Test coverage gaps</w:t>
-      </w:r>
-    </w:p>
-    <w:p>
-      <w:pPr>
-        <w:pStyle w:val="ListNumber"/>
-      </w:pPr>
-      <w:r>
-        <w:t>Known gaps: no real-device tests; speech recognition is faked in tests; not every spec stop path or region-to-pattern mapping is covered; 3D is checked only for render and offline; no fuzzing of imported backups beyond the basic invalid cases.</w:t>
-      </w:r>
-    </w:p>
-    <w:p>
-      <w:r>
-        <w:rPr>
-          <w:b/>
-        </w:rPr>
-        <w:t>Known uncertainties (from the v0.6 and v0.7 reports)</w:t>
-      </w:r>
-    </w:p>
-    <w:p>
-      <w:pPr>
-        <w:pStyle w:val="ListBullet"/>
-      </w:pPr>
-      <w:r>
-        <w:t>Lighter sessions do not count towards finishing calibration, so it can take slightly longer (R23).</w:t>
-      </w:r>
-    </w:p>
-    <w:p>
-      <w:pPr>
-        <w:pStyle w:val="ListBullet"/>
-      </w:pPr>
-      <w:r>
-        <w:t>Pain during a modification puts the movement on hold. That is consistent with the check-in pain rule, but it has had no clinical review.</w:t>
-      </w:r>
-    </w:p>
-    <w:p>
-      <w:pPr>
-        <w:pStyle w:val="ListBullet"/>
-      </w:pPr>
-      <w:r>
-        <w:t>Lighthouse performance is about 71 because the 3D coach dominates blocking time in headless Chrome. Real iPhone performance is unmeasured.</w:t>
-      </w:r>
-    </w:p>
-    <w:p>
-      <w:pPr>
-        <w:pStyle w:val="ListBullet"/>
-      </w:pPr>
-      <w:r>
-        <w:t>Every threshold in R1–R26 and X1–X8 is a placeholder without expert validation.</w:t>
+        <w:t>R1–R26 and X1–X9 were approved by the owner in Decision Round 1 (27 Oct 2026) without external expert validation; the pre-launch reviews listed in §4 are still required.</w:t>
       </w:r>
     </w:p>
     <w:p>

</xml_diff>

<commit_message>
v0.9.2: Decision Round 2 approved — amendments A1–A5, ability summary, 'Something else' counter-offer, accept note, calibration Easier/Harder
</commit_message>
<xml_diff>
--- a/docs/AUDIT-HANDOFF.docx
+++ b/docs/AUDIT-HANDOFF.docx
@@ -7,7 +7,7 @@
         <w:pStyle w:val="Heading1"/>
       </w:pPr>
       <w:r>
-        <w:t>FitcoachAI — Audit handoff (prototype v0.9.1)</w:t>
+        <w:t>FitcoachAI — Audit handoff (prototype v0.9.2)</w:t>
       </w:r>
     </w:p>
     <w:p>
@@ -922,7 +922,10 @@
           <w:p>
             <w:r/>
             <w:r>
-              <w:t>(this release)</w:t>
+              <w:rPr>
+                <w:rFonts w:ascii="Courier New" w:hAnsi="Courier New"/>
+              </w:rPr>
+              <w:t>2235d65</w:t>
             </w:r>
           </w:p>
         </w:tc>
@@ -956,6 +959,59 @@
           </w:p>
         </w:tc>
       </w:tr>
+      <w:tr>
+        <w:tc>
+          <w:tcPr>
+            <w:tcW w:type="dxa" w:w="2880"/>
+          </w:tcPr>
+          <w:p>
+            <w:r/>
+            <w:r>
+              <w:t>v0.9.2</w:t>
+            </w:r>
+          </w:p>
+        </w:tc>
+        <w:tc>
+          <w:tcPr>
+            <w:tcW w:type="dxa" w:w="2880"/>
+          </w:tcPr>
+          <w:p>
+            <w:r/>
+            <w:r>
+              <w:t>(this release)</w:t>
+            </w:r>
+          </w:p>
+        </w:tc>
+        <w:tc>
+          <w:tcPr>
+            <w:tcW w:type="dxa" w:w="2880"/>
+          </w:tcPr>
+          <w:p>
+            <w:r/>
+            <w:r>
+              <w:t>Decision Round 2 applied: amendments A1–A5 to the locked doc (</w:t>
+            </w:r>
+            <w:r>
+              <w:rPr>
+                <w:rFonts w:ascii="Courier New" w:hAnsi="Courier New"/>
+              </w:rPr>
+              <w:t>docs/CORE-PRODUCT-LOGICS-AMENDMENTS.md</w:t>
+            </w:r>
+            <w:r>
+              <w:t>); ability summary; "Something else" counter-offer after calibration; accept note; Easier/Harder ±1 during calibration (</w:t>
+            </w:r>
+            <w:r>
+              <w:rPr>
+                <w:rFonts w:ascii="Courier New" w:hAnsi="Courier New"/>
+              </w:rPr>
+              <w:t>js/v092.js</w:t>
+            </w:r>
+            <w:r>
+              <w:t>).</w:t>
+            </w:r>
+          </w:p>
+        </w:tc>
+      </w:tr>
     </w:tbl>
     <w:p>
       <w:pPr>
@@ -1219,7 +1275,7 @@
         <w:rPr>
           <w:rFonts w:ascii="Courier New" w:hAnsi="Courier New"/>
         </w:rPr>
-        <w:t>fcai-v0.9.1</w:t>
+        <w:t>fcai-v0.9.2</w:t>
       </w:r>
       <w:r>
         <w:t>) that precaches the app, three.js and the 3D model.</w:t>
@@ -2280,6 +2336,15 @@
         <w:rPr>
           <w:rFonts w:ascii="Courier New" w:hAnsi="Courier New"/>
         </w:rPr>
+        <w:t>v092.js</w:t>
+      </w:r>
+      <w:r>
+        <w:t xml:space="preserve"> (Decision Round 2), </w:t>
+      </w:r>
+      <w:r>
+        <w:rPr>
+          <w:rFonts w:ascii="Courier New" w:hAnsi="Courier New"/>
+        </w:rPr>
         <w:t>v06.js</w:t>
       </w:r>
       <w:r>
@@ -2301,7 +2366,7 @@
         <w:t>v072.js</w:t>
       </w:r>
       <w:r>
-        <w:t xml:space="preserve"> (3D coach reduced motion / fit / fallback, caption bar vs Stop). At v0.9.1 all 11 suites pass on Chromium and WebKit (see README for the runner).</w:t>
+        <w:t xml:space="preserve"> (3D coach reduced motion / fit / fallback, caption bar vs Stop). At v0.9.2 all 12 suites pass on Chromium and WebKit (see README for the runner).</w:t>
       </w:r>
     </w:p>
     <w:p>
@@ -2426,7 +2491,16 @@
         <w:t>docs/PRE-NATIVE-REVIEW.md</w:t>
       </w:r>
       <w:r>
-        <w:t>): conflicts between the locked CORE-PRODUCT-LOGICS doc and the prototype, to decide before the native build.</w:t>
+        <w:t xml:space="preserve">): all approved on 2026-10-27. The amendments to the locked doc are in </w:t>
+      </w:r>
+      <w:r>
+        <w:rPr>
+          <w:rFonts w:ascii="Courier New" w:hAnsi="Courier New"/>
+        </w:rPr>
+        <w:t>docs/CORE-PRODUCT-LOGICS-AMENDMENTS.md</w:t>
+      </w:r>
+      <w:r>
+        <w:t>, and the deferred parts are in RESEARCH-FLAGS (D2-2b, D2-4 legal, D2-6b/c, D2-9, D2-10b).</w:t>
       </w:r>
     </w:p>
     <w:p>
@@ -2621,16 +2695,16 @@
         <w:t>docs/CORE-PRODUCT-LOGICS.docx</w:t>
       </w:r>
       <w:r>
-        <w:t xml:space="preserve"> and the APPROVED items against what the code does. Known conflicts are listed in </w:t>
+        <w:t xml:space="preserve"> and the APPROVED items against what the code does. Read it together with the approved amendments in </w:t>
       </w:r>
       <w:r>
         <w:rPr>
           <w:rFonts w:ascii="Courier New" w:hAnsi="Courier New"/>
         </w:rPr>
-        <w:t>docs/PRE-NATIVE-REVIEW.md</w:t>
-      </w:r>
-      <w:r>
-        <w:t xml:space="preserve"> (Decision Round 2).</w:t>
+        <w:t>docs/CORE-PRODUCT-LOGICS-AMENDMENTS.md</w:t>
+      </w:r>
+      <w:r>
+        <w:t xml:space="preserve"> (A1–A5).</w:t>
       </w:r>
     </w:p>
     <w:p>

</xml_diff>